<commit_message>
TS 5.6 Kramam Tamil Sanskrit corrections
</commit_message>
<xml_diff>
--- a/TS-Kramam/TS-5.6/TS 5.6 Tamil Krama Paatam Corrections.docx
+++ b/TS-Kramam/TS-5.6/TS 5.6 Tamil Krama Paatam Corrections.docx
@@ -44,7 +44,6 @@
         </w:rPr>
         <w:t xml:space="preserve"> Paatam – TS </w:t>
       </w:r>
-      <w:proofErr w:type="gramStart"/>
       <w:r>
         <w:rPr>
           <w:b/>
@@ -73,18 +72,7 @@
           <w:szCs w:val="32"/>
           <w:u w:val="single"/>
         </w:rPr>
-        <w:t>Tamil</w:t>
-      </w:r>
-      <w:proofErr w:type="gramEnd"/>
-      <w:r>
-        <w:rPr>
-          <w:b/>
-          <w:bCs/>
-          <w:sz w:val="32"/>
-          <w:szCs w:val="32"/>
-          <w:u w:val="single"/>
-        </w:rPr>
-        <w:t xml:space="preserve"> </w:t>
+        <w:t xml:space="preserve">Tamil </w:t>
       </w:r>
       <w:r>
         <w:rPr>
@@ -114,18 +102,7 @@
           <w:szCs w:val="32"/>
           <w:u w:val="single"/>
         </w:rPr>
-        <w:t xml:space="preserve">Observed </w:t>
-      </w:r>
-      <w:proofErr w:type="gramStart"/>
-      <w:r>
-        <w:rPr>
-          <w:b/>
-          <w:bCs/>
-          <w:sz w:val="32"/>
-          <w:szCs w:val="32"/>
-          <w:u w:val="single"/>
-        </w:rPr>
-        <w:t xml:space="preserve">till </w:t>
+        <w:t xml:space="preserve">Observed till </w:t>
       </w:r>
       <w:r>
         <w:rPr>
@@ -138,7 +115,6 @@
         </w:rPr>
         <w:t>????</w:t>
       </w:r>
-      <w:proofErr w:type="gramEnd"/>
     </w:p>
     <w:p>
       <w:pPr>
@@ -840,7 +816,7 @@
       </w:tr>
       <w:tr>
         <w:trPr>
-          <w:trHeight w:val="1972"/>
+          <w:trHeight w:val="1980"/>
         </w:trPr>
         <w:tc>
           <w:tcPr>
@@ -1007,9 +983,8 @@
             <w:r>
               <w:rPr>
                 <w:rFonts w:ascii="Latha" w:hAnsi="Latha" w:cs="Latha"/>
-                <w:b/>
-                <w:bCs/>
-                <w:szCs w:val="24"/>
+                <w:sz w:val="28"/>
+                <w:szCs w:val="28"/>
                 <w:cs/>
                 <w:lang w:bidi="ta-IN"/>
               </w:rPr>
@@ -1029,9 +1004,8 @@
             <w:r>
               <w:rPr>
                 <w:rFonts w:ascii="Latha" w:hAnsi="Latha" w:cs="Latha"/>
-                <w:b/>
-                <w:bCs/>
-                <w:szCs w:val="24"/>
+                <w:sz w:val="28"/>
+                <w:szCs w:val="28"/>
                 <w:cs/>
                 <w:lang w:bidi="ta-IN"/>
               </w:rPr>
@@ -1051,9 +1025,8 @@
             <w:r>
               <w:rPr>
                 <w:rFonts w:ascii="Latha" w:hAnsi="Latha" w:cs="Latha"/>
-                <w:b/>
-                <w:bCs/>
-                <w:szCs w:val="24"/>
+                <w:sz w:val="28"/>
+                <w:szCs w:val="28"/>
                 <w:cs/>
                 <w:lang w:bidi="ta-IN"/>
               </w:rPr>
@@ -1062,10 +1035,9 @@
             <w:r>
               <w:rPr>
                 <w:rFonts w:ascii="Latha" w:hAnsi="Latha" w:cs="Latha"/>
-                <w:b/>
-                <w:bCs/>
                 <w:position w:val="-12"/>
-                <w:szCs w:val="24"/>
+                <w:sz w:val="28"/>
+                <w:szCs w:val="28"/>
                 <w:cs/>
                 <w:lang w:bidi="ta-IN"/>
               </w:rPr>
@@ -1095,9 +1067,8 @@
             <w:r>
               <w:rPr>
                 <w:rFonts w:ascii="Latha" w:hAnsi="Latha" w:cs="Latha"/>
-                <w:b/>
-                <w:bCs/>
-                <w:szCs w:val="24"/>
+                <w:sz w:val="28"/>
+                <w:szCs w:val="28"/>
                 <w:cs/>
                 <w:lang w:bidi="ta-IN"/>
               </w:rPr>
@@ -1108,7 +1079,8 @@
                 <w:rFonts w:ascii="Latha" w:hAnsi="Latha" w:cs="Latha"/>
                 <w:b/>
                 <w:bCs/>
-                <w:szCs w:val="24"/>
+                <w:sz w:val="28"/>
+                <w:szCs w:val="28"/>
                 <w:highlight w:val="yellow"/>
                 <w:cs/>
                 <w:lang w:bidi="ta-IN"/>
@@ -1129,9 +1101,8 @@
             <w:r>
               <w:rPr>
                 <w:rFonts w:ascii="Latha" w:hAnsi="Latha" w:cs="Latha"/>
-                <w:b/>
-                <w:bCs/>
-                <w:szCs w:val="24"/>
+                <w:sz w:val="28"/>
+                <w:szCs w:val="28"/>
                 <w:cs/>
                 <w:lang w:bidi="ta-IN"/>
               </w:rPr>
@@ -1151,9 +1122,8 @@
             <w:r>
               <w:rPr>
                 <w:rFonts w:ascii="Latha" w:hAnsi="Latha" w:cs="Latha"/>
-                <w:b/>
-                <w:bCs/>
-                <w:szCs w:val="24"/>
+                <w:sz w:val="28"/>
+                <w:szCs w:val="28"/>
                 <w:cs/>
                 <w:lang w:bidi="ta-IN"/>
               </w:rPr>
@@ -1162,34 +1132,52 @@
             <w:r>
               <w:rPr>
                 <w:rFonts w:ascii="Latha" w:hAnsi="Latha" w:cs="Latha"/>
-                <w:b/>
-                <w:bCs/>
+                <w:sz w:val="28"/>
+                <w:szCs w:val="28"/>
+                <w:lang w:val="it-IT" w:bidi="ta-IN"/>
+              </w:rPr>
+              <w:t xml:space="preserve"> </w:t>
+            </w:r>
+            <w:r>
+              <w:rPr>
+                <w:rFonts w:ascii="Latha" w:hAnsi="Latha" w:cs="Latha"/>
+                <w:sz w:val="28"/>
+                <w:szCs w:val="28"/>
+                <w:cs/>
+                <w:lang w:bidi="ta-IN"/>
+              </w:rPr>
+              <w:t>யேத்யன்ன</w:t>
+            </w:r>
+            <w:r>
+              <w:rPr>
+                <w:rFonts w:ascii="BRH Tamil Tab Extra" w:hAnsi="BRH Tamil Tab Extra" w:cs="Latha"/>
+                <w:b/>
+                <w:bCs/>
+                <w:sz w:val="32"/>
                 <w:szCs w:val="24"/>
                 <w:lang w:val="it-IT" w:bidi="ta-IN"/>
               </w:rPr>
-              <w:t xml:space="preserve"> </w:t>
-            </w:r>
-            <w:r>
-              <w:rPr>
-                <w:rFonts w:ascii="Latha" w:hAnsi="Latha" w:cs="Latha"/>
-                <w:b/>
-                <w:bCs/>
-                <w:szCs w:val="24"/>
-                <w:cs/>
-                <w:lang w:bidi="ta-IN"/>
-              </w:rPr>
-              <w:t>யேத்யன்ன</w:t>
-            </w:r>
-            <w:r>
-              <w:rPr>
-                <w:rFonts w:ascii="BRH Tamil Tab Extra" w:hAnsi="BRH Tamil Tab Extra" w:cs="Latha"/>
-                <w:b/>
-                <w:bCs/>
-                <w:sz w:val="32"/>
+              <w:t>†</w:t>
+            </w:r>
+            <w:r>
+              <w:rPr>
+                <w:rFonts w:ascii="Latha" w:hAnsi="Latha" w:cs="Latha"/>
+                <w:sz w:val="28"/>
+                <w:szCs w:val="28"/>
+                <w:cs/>
+                <w:lang w:bidi="ta-IN"/>
+              </w:rPr>
+              <w:t>ஸ்ய</w:t>
+            </w:r>
+            <w:r>
+              <w:rPr>
+                <w:rFonts w:ascii="Latha" w:hAnsi="Latha" w:cs="Latha"/>
+                <w:b/>
+                <w:bCs/>
                 <w:szCs w:val="24"/>
                 <w:lang w:val="it-IT" w:bidi="ta-IN"/>
               </w:rPr>
-              <w:t>†</w:t>
+              <w:t xml:space="preserve"> -</w:t>
             </w:r>
             <w:r>
               <w:rPr>
@@ -1200,28 +1188,38 @@
                 <w:cs/>
                 <w:lang w:bidi="ta-IN"/>
               </w:rPr>
-              <w:t>ஸ்ய</w:t>
-            </w:r>
-            <w:r>
-              <w:rPr>
-                <w:rFonts w:ascii="Latha" w:hAnsi="Latha" w:cs="Latha"/>
-                <w:b/>
-                <w:bCs/>
+              <w:t xml:space="preserve"> </w:t>
+            </w:r>
+            <w:r>
+              <w:rPr>
+                <w:rFonts w:ascii="Latha" w:hAnsi="Latha" w:cs="Latha"/>
+                <w:sz w:val="28"/>
+                <w:szCs w:val="28"/>
+                <w:cs/>
+                <w:lang w:bidi="ta-IN"/>
+              </w:rPr>
+              <w:t>அ</w:t>
+            </w:r>
+            <w:r>
+              <w:rPr>
+                <w:rFonts w:ascii="BRH Tamil Tab Extra" w:hAnsi="BRH Tamil Tab Extra" w:cs="Latha"/>
+                <w:b/>
+                <w:bCs/>
+                <w:sz w:val="28"/>
                 <w:szCs w:val="24"/>
                 <w:lang w:val="it-IT" w:bidi="ta-IN"/>
               </w:rPr>
-              <w:t xml:space="preserve"> -</w:t>
-            </w:r>
-            <w:r>
-              <w:rPr>
-                <w:rFonts w:ascii="Latha" w:hAnsi="Latha" w:cs="Latha"/>
-                <w:b/>
-                <w:bCs/>
-                <w:szCs w:val="24"/>
-                <w:cs/>
-                <w:lang w:bidi="ta-IN"/>
-              </w:rPr>
-              <w:t xml:space="preserve"> அ</w:t>
+              <w:t>…</w:t>
+            </w:r>
+            <w:r>
+              <w:rPr>
+                <w:rFonts w:ascii="Latha" w:hAnsi="Latha" w:cs="Latha"/>
+                <w:sz w:val="28"/>
+                <w:szCs w:val="28"/>
+                <w:cs/>
+                <w:lang w:bidi="ta-IN"/>
+              </w:rPr>
+              <w:t>ன்ன</w:t>
             </w:r>
             <w:r>
               <w:rPr>
@@ -1237,31 +1235,8 @@
             <w:r>
               <w:rPr>
                 <w:rFonts w:ascii="Latha" w:hAnsi="Latha" w:cs="Latha"/>
-                <w:b/>
-                <w:bCs/>
-                <w:szCs w:val="24"/>
-                <w:cs/>
-                <w:lang w:bidi="ta-IN"/>
-              </w:rPr>
-              <w:t>ன்ன</w:t>
-            </w:r>
-            <w:r>
-              <w:rPr>
-                <w:rFonts w:ascii="BRH Tamil Tab Extra" w:hAnsi="BRH Tamil Tab Extra" w:cs="Latha"/>
-                <w:b/>
-                <w:bCs/>
-                <w:sz w:val="28"/>
-                <w:szCs w:val="24"/>
-                <w:lang w:val="it-IT" w:bidi="ta-IN"/>
-              </w:rPr>
-              <w:t>…</w:t>
-            </w:r>
-            <w:r>
-              <w:rPr>
-                <w:rFonts w:ascii="Latha" w:hAnsi="Latha" w:cs="Latha"/>
-                <w:b/>
-                <w:bCs/>
-                <w:szCs w:val="24"/>
+                <w:sz w:val="28"/>
+                <w:szCs w:val="28"/>
                 <w:cs/>
                 <w:lang w:bidi="ta-IN"/>
               </w:rPr>
@@ -1313,167 +1288,6 @@
               <w:spacing w:before="0" w:line="240" w:lineRule="auto"/>
               <w:jc w:val="both"/>
               <w:rPr>
-                <w:rFonts w:ascii="Latha" w:hAnsi="Latha" w:cs="Latha"/>
-                <w:b/>
-                <w:bCs/>
-                <w:szCs w:val="24"/>
-                <w:lang w:val="it-IT" w:bidi="ta-IN"/>
-              </w:rPr>
-            </w:pPr>
-            <w:r>
-              <w:rPr>
-                <w:rFonts w:ascii="Latha" w:hAnsi="Latha" w:cs="Latha"/>
-                <w:b/>
-                <w:bCs/>
-                <w:szCs w:val="24"/>
-                <w:cs/>
-                <w:lang w:bidi="ta-IN"/>
-              </w:rPr>
-              <w:t>அன்ன</w:t>
-            </w:r>
-            <w:r>
-              <w:rPr>
-                <w:rFonts w:ascii="BRH Tamil Tab Extra" w:hAnsi="BRH Tamil Tab Extra" w:cs="Latha"/>
-                <w:b/>
-                <w:bCs/>
-                <w:sz w:val="32"/>
-                <w:szCs w:val="24"/>
-                <w:lang w:val="it-IT" w:bidi="ta-IN"/>
-              </w:rPr>
-              <w:t>†</w:t>
-            </w:r>
-            <w:r>
-              <w:rPr>
-                <w:rFonts w:ascii="Latha" w:hAnsi="Latha" w:cs="Latha"/>
-                <w:b/>
-                <w:bCs/>
-                <w:szCs w:val="24"/>
-                <w:cs/>
-                <w:lang w:bidi="ta-IN"/>
-              </w:rPr>
-              <w:t>ஸ்யான்னஸ்யா</w:t>
-            </w:r>
-            <w:r>
-              <w:rPr>
-                <w:rFonts w:ascii="BRH Tamil Tab Extra" w:hAnsi="BRH Tamil Tab Extra" w:cs="Latha"/>
-                <w:b/>
-                <w:bCs/>
-                <w:sz w:val="28"/>
-                <w:szCs w:val="24"/>
-                <w:lang w:val="it-IT" w:bidi="ta-IN"/>
-              </w:rPr>
-              <w:t>…</w:t>
-            </w:r>
-            <w:r>
-              <w:rPr>
-                <w:rFonts w:ascii="Latha" w:hAnsi="Latha" w:cs="Latha"/>
-                <w:b/>
-                <w:bCs/>
-                <w:szCs w:val="24"/>
-                <w:cs/>
-                <w:lang w:bidi="ta-IN"/>
-              </w:rPr>
-              <w:t>பி</w:t>
-            </w:r>
-            <w:r>
-              <w:rPr>
-                <w:rFonts w:ascii="Latha" w:hAnsi="Latha" w:cs="Latha"/>
-                <w:b/>
-                <w:bCs/>
-                <w:position w:val="-12"/>
-                <w:szCs w:val="24"/>
-                <w:cs/>
-                <w:lang w:bidi="ta-IN"/>
-              </w:rPr>
-              <w:t>4</w:t>
-            </w:r>
-            <w:r>
-              <w:rPr>
-                <w:rFonts w:ascii="Latha" w:hAnsi="Latha" w:cs="Latha"/>
-                <w:b/>
-                <w:bCs/>
-                <w:szCs w:val="24"/>
-                <w:lang w:val="it-IT" w:bidi="ta-IN"/>
-              </w:rPr>
-              <w:t xml:space="preserve"> | </w:t>
-            </w:r>
-            <w:r>
-              <w:rPr>
-                <w:rFonts w:ascii="Latha" w:hAnsi="Latha" w:cs="Latha"/>
-                <w:b/>
-                <w:bCs/>
-                <w:szCs w:val="24"/>
-                <w:cs/>
-                <w:lang w:bidi="ta-IN"/>
-              </w:rPr>
-              <w:t>அன்</w:t>
-            </w:r>
-            <w:r>
-              <w:rPr>
-                <w:rFonts w:ascii="Latha" w:hAnsi="Latha" w:cs="Latha"/>
-                <w:b/>
-                <w:bCs/>
-                <w:szCs w:val="24"/>
-                <w:highlight w:val="green"/>
-                <w:cs/>
-                <w:lang w:bidi="ta-IN"/>
-              </w:rPr>
-              <w:t>ன</w:t>
-            </w:r>
-            <w:r>
-              <w:rPr>
-                <w:rFonts w:ascii="BRH Tamil Tab Extra" w:hAnsi="BRH Tamil Tab Extra" w:cs="Latha"/>
-                <w:b/>
-                <w:bCs/>
-                <w:sz w:val="32"/>
-                <w:szCs w:val="24"/>
-                <w:lang w:val="it-IT" w:bidi="ta-IN"/>
-              </w:rPr>
-              <w:t>†</w:t>
-            </w:r>
-            <w:r>
-              <w:rPr>
-                <w:rFonts w:ascii="Latha" w:hAnsi="Latha" w:cs="Latha"/>
-                <w:b/>
-                <w:bCs/>
-                <w:szCs w:val="24"/>
-                <w:cs/>
-                <w:lang w:bidi="ta-IN"/>
-              </w:rPr>
-              <w:t>ஸ்யான்ன</w:t>
-            </w:r>
-            <w:r>
-              <w:rPr>
-                <w:rFonts w:ascii="BRH Tamil Tab Extra" w:hAnsi="BRH Tamil Tab Extra" w:cs="Latha"/>
-                <w:b/>
-                <w:bCs/>
-                <w:sz w:val="28"/>
-                <w:szCs w:val="24"/>
-                <w:lang w:val="it-IT" w:bidi="ta-IN"/>
-              </w:rPr>
-              <w:t>…</w:t>
-            </w:r>
-            <w:r>
-              <w:rPr>
-                <w:rFonts w:ascii="Latha" w:hAnsi="Latha" w:cs="Latha"/>
-                <w:b/>
-                <w:bCs/>
-                <w:szCs w:val="24"/>
-                <w:cs/>
-                <w:lang w:bidi="ta-IN"/>
-              </w:rPr>
-              <w:t>ஸ்</w:t>
-            </w:r>
-          </w:p>
-          <w:p>
-            <w:pPr>
-              <w:widowControl w:val="0"/>
-              <w:autoSpaceDE w:val="0"/>
-              <w:autoSpaceDN w:val="0"/>
-              <w:adjustRightInd w:val="0"/>
-              <w:spacing w:before="0" w:line="240" w:lineRule="auto"/>
-              <w:jc w:val="both"/>
-              <w:rPr>
                 <w:rFonts w:ascii="BRH Malayalam Extra" w:eastAsia="Times New Roman" w:hAnsi="BRH Malayalam Extra" w:cs="BRH Malayalam Extra"/>
                 <w:color w:val="000000"/>
                 <w:sz w:val="40"/>
@@ -1484,13 +1298,12 @@
             <w:r>
               <w:rPr>
                 <w:rFonts w:ascii="Latha" w:hAnsi="Latha" w:cs="Latha"/>
-                <w:b/>
-                <w:bCs/>
-                <w:szCs w:val="24"/>
-                <w:cs/>
-                <w:lang w:bidi="ta-IN"/>
-              </w:rPr>
-              <w:t>யேத்யன்ன</w:t>
+                <w:sz w:val="28"/>
+                <w:szCs w:val="28"/>
+                <w:cs/>
+                <w:lang w:bidi="ta-IN"/>
+              </w:rPr>
+              <w:t>அன்ன</w:t>
             </w:r>
             <w:r>
               <w:rPr>
@@ -1506,74 +1319,247 @@
             <w:r>
               <w:rPr>
                 <w:rFonts w:ascii="Latha" w:hAnsi="Latha" w:cs="Latha"/>
-                <w:b/>
-                <w:bCs/>
-                <w:szCs w:val="24"/>
-                <w:cs/>
-                <w:lang w:bidi="ta-IN"/>
-              </w:rPr>
-              <w:t>ஸ்ய</w:t>
-            </w:r>
-            <w:r>
-              <w:rPr>
-                <w:rFonts w:ascii="Latha" w:hAnsi="Latha" w:cs="Latha"/>
-                <w:b/>
-                <w:bCs/>
+                <w:sz w:val="28"/>
+                <w:szCs w:val="28"/>
+                <w:cs/>
+                <w:lang w:bidi="ta-IN"/>
+              </w:rPr>
+              <w:t>ஸ்யான்னஸ்யா</w:t>
+            </w:r>
+            <w:r>
+              <w:rPr>
+                <w:rFonts w:ascii="BRH Tamil Tab Extra" w:hAnsi="BRH Tamil Tab Extra" w:cs="Latha"/>
+                <w:b/>
+                <w:bCs/>
+                <w:sz w:val="28"/>
                 <w:szCs w:val="24"/>
                 <w:lang w:val="it-IT" w:bidi="ta-IN"/>
               </w:rPr>
-              <w:t xml:space="preserve"> - </w:t>
-            </w:r>
-            <w:r>
-              <w:rPr>
-                <w:rFonts w:ascii="Latha" w:hAnsi="Latha" w:cs="Latha"/>
-                <w:b/>
-                <w:bCs/>
-                <w:szCs w:val="24"/>
-                <w:cs/>
-                <w:lang w:bidi="ta-IN"/>
-              </w:rPr>
-              <w:t>அ</w:t>
-            </w:r>
-            <w:r>
-              <w:rPr>
-                <w:rFonts w:ascii="BRH Tamil Tab Extra" w:hAnsi="BRH Tamil Tab Extra" w:cs="Latha"/>
-                <w:b/>
-                <w:bCs/>
-                <w:sz w:val="28"/>
+              <w:t>…</w:t>
+            </w:r>
+            <w:r>
+              <w:rPr>
+                <w:rFonts w:ascii="Latha" w:hAnsi="Latha" w:cs="Latha"/>
+                <w:sz w:val="28"/>
+                <w:szCs w:val="28"/>
+                <w:cs/>
+                <w:lang w:bidi="ta-IN"/>
+              </w:rPr>
+              <w:t>பி</w:t>
+            </w:r>
+            <w:r>
+              <w:rPr>
+                <w:rFonts w:ascii="Latha" w:hAnsi="Latha" w:cs="Latha"/>
+                <w:position w:val="-12"/>
+                <w:sz w:val="28"/>
+                <w:szCs w:val="28"/>
+                <w:cs/>
+                <w:lang w:bidi="ta-IN"/>
+              </w:rPr>
+              <w:t>4</w:t>
+            </w:r>
+            <w:r>
+              <w:rPr>
+                <w:rFonts w:ascii="Latha" w:hAnsi="Latha" w:cs="Latha"/>
+                <w:b/>
+                <w:bCs/>
+                <w:position w:val="-12"/>
                 <w:szCs w:val="24"/>
                 <w:lang w:val="it-IT" w:bidi="ta-IN"/>
               </w:rPr>
-              <w:t>…</w:t>
-            </w:r>
-            <w:r>
-              <w:rPr>
-                <w:rFonts w:ascii="Latha" w:hAnsi="Latha" w:cs="Latha"/>
-                <w:b/>
-                <w:bCs/>
-                <w:szCs w:val="24"/>
-                <w:cs/>
-                <w:lang w:bidi="ta-IN"/>
-              </w:rPr>
-              <w:t>ன்ன</w:t>
-            </w:r>
-            <w:r>
-              <w:rPr>
-                <w:rFonts w:ascii="BRH Tamil Tab Extra" w:hAnsi="BRH Tamil Tab Extra" w:cs="Latha"/>
-                <w:b/>
-                <w:bCs/>
-                <w:sz w:val="28"/>
+              <w:t xml:space="preserve"> </w:t>
+            </w:r>
+            <w:r>
+              <w:rPr>
+                <w:rFonts w:ascii="Latha" w:hAnsi="Latha" w:cs="Latha"/>
+                <w:b/>
+                <w:bCs/>
                 <w:szCs w:val="24"/>
                 <w:lang w:val="it-IT" w:bidi="ta-IN"/>
               </w:rPr>
+              <w:t xml:space="preserve">| </w:t>
+            </w:r>
+            <w:r>
+              <w:rPr>
+                <w:rFonts w:ascii="Latha" w:hAnsi="Latha" w:cs="Latha"/>
+                <w:b/>
+                <w:bCs/>
+                <w:szCs w:val="24"/>
+                <w:lang w:val="it-IT" w:bidi="ta-IN"/>
+              </w:rPr>
+              <w:br/>
+            </w:r>
+            <w:r>
+              <w:rPr>
+                <w:rFonts w:ascii="Latha" w:hAnsi="Latha" w:cs="Latha"/>
+                <w:sz w:val="28"/>
+                <w:szCs w:val="28"/>
+                <w:cs/>
+                <w:lang w:bidi="ta-IN"/>
+              </w:rPr>
+              <w:t>அன்</w:t>
+            </w:r>
+            <w:r>
+              <w:rPr>
+                <w:rFonts w:ascii="Latha" w:hAnsi="Latha" w:cs="Latha"/>
+                <w:sz w:val="28"/>
+                <w:szCs w:val="28"/>
+                <w:highlight w:val="green"/>
+                <w:cs/>
+                <w:lang w:bidi="ta-IN"/>
+              </w:rPr>
+              <w:t>ன</w:t>
+            </w:r>
+            <w:r>
+              <w:rPr>
+                <w:rFonts w:ascii="BRH Tamil Tab Extra" w:hAnsi="BRH Tamil Tab Extra" w:cs="Latha"/>
+                <w:b/>
+                <w:bCs/>
+                <w:sz w:val="32"/>
+                <w:szCs w:val="24"/>
+                <w:lang w:val="it-IT" w:bidi="ta-IN"/>
+              </w:rPr>
+              <w:t>†</w:t>
+            </w:r>
+            <w:r>
+              <w:rPr>
+                <w:rFonts w:ascii="Latha" w:hAnsi="Latha" w:cs="Latha"/>
+                <w:sz w:val="28"/>
+                <w:szCs w:val="28"/>
+                <w:cs/>
+                <w:lang w:bidi="ta-IN"/>
+              </w:rPr>
+              <w:t>ஸ்யான்ன</w:t>
+            </w:r>
+            <w:r>
+              <w:rPr>
+                <w:rFonts w:ascii="BRH Tamil Tab Extra" w:hAnsi="BRH Tamil Tab Extra" w:cs="Latha"/>
+                <w:b/>
+                <w:bCs/>
+                <w:sz w:val="28"/>
+                <w:szCs w:val="24"/>
+                <w:lang w:val="it-IT" w:bidi="ta-IN"/>
+              </w:rPr>
               <w:t>…</w:t>
             </w:r>
             <w:r>
               <w:rPr>
                 <w:rFonts w:ascii="Latha" w:hAnsi="Latha" w:cs="Latha"/>
-                <w:b/>
-                <w:bCs/>
+                <w:sz w:val="28"/>
+                <w:szCs w:val="28"/>
+                <w:cs/>
+                <w:lang w:bidi="ta-IN"/>
+              </w:rPr>
+              <w:t>ஸ்</w:t>
+            </w:r>
+            <w:r>
+              <w:rPr>
+                <w:rFonts w:ascii="Latha" w:hAnsi="Latha" w:cs="Latha"/>
+                <w:sz w:val="28"/>
+                <w:szCs w:val="28"/>
+                <w:lang w:val="it-IT" w:bidi="ta-IN"/>
+              </w:rPr>
+              <w:t xml:space="preserve"> </w:t>
+            </w:r>
+            <w:r>
+              <w:rPr>
+                <w:rFonts w:ascii="Latha" w:hAnsi="Latha" w:cs="Latha"/>
+                <w:sz w:val="28"/>
+                <w:szCs w:val="28"/>
+                <w:cs/>
+                <w:lang w:bidi="ta-IN"/>
+              </w:rPr>
+              <w:t>யேத்யன்ன</w:t>
+            </w:r>
+            <w:r>
+              <w:rPr>
+                <w:rFonts w:ascii="BRH Tamil Tab Extra" w:hAnsi="BRH Tamil Tab Extra" w:cs="Latha"/>
+                <w:b/>
+                <w:bCs/>
+                <w:sz w:val="32"/>
                 <w:szCs w:val="24"/>
+                <w:lang w:val="it-IT" w:bidi="ta-IN"/>
+              </w:rPr>
+              <w:t>†</w:t>
+            </w:r>
+            <w:r>
+              <w:rPr>
+                <w:rFonts w:ascii="Latha" w:hAnsi="Latha" w:cs="Latha"/>
+                <w:sz w:val="28"/>
+                <w:szCs w:val="28"/>
+                <w:cs/>
+                <w:lang w:bidi="ta-IN"/>
+              </w:rPr>
+              <w:t>ஸ்ய</w:t>
+            </w:r>
+            <w:r>
+              <w:rPr>
+                <w:rFonts w:ascii="Latha" w:hAnsi="Latha" w:cs="Latha"/>
+                <w:b/>
+                <w:bCs/>
+                <w:szCs w:val="24"/>
+                <w:lang w:val="it-IT" w:bidi="ta-IN"/>
+              </w:rPr>
+              <w:t xml:space="preserve"> -</w:t>
+            </w:r>
+            <w:r>
+              <w:rPr>
+                <w:rFonts w:ascii="Latha" w:hAnsi="Latha" w:cs="Latha"/>
+                <w:b/>
+                <w:bCs/>
+                <w:szCs w:val="24"/>
+                <w:cs/>
+                <w:lang w:bidi="ta-IN"/>
+              </w:rPr>
+              <w:t xml:space="preserve"> </w:t>
+            </w:r>
+            <w:r>
+              <w:rPr>
+                <w:rFonts w:ascii="Latha" w:hAnsi="Latha" w:cs="Latha"/>
+                <w:sz w:val="28"/>
+                <w:szCs w:val="28"/>
+                <w:cs/>
+                <w:lang w:bidi="ta-IN"/>
+              </w:rPr>
+              <w:t>அ</w:t>
+            </w:r>
+            <w:r>
+              <w:rPr>
+                <w:rFonts w:ascii="BRH Tamil Tab Extra" w:hAnsi="BRH Tamil Tab Extra" w:cs="Latha"/>
+                <w:b/>
+                <w:bCs/>
+                <w:sz w:val="28"/>
+                <w:szCs w:val="24"/>
+                <w:lang w:val="it-IT" w:bidi="ta-IN"/>
+              </w:rPr>
+              <w:t>…</w:t>
+            </w:r>
+            <w:r>
+              <w:rPr>
+                <w:rFonts w:ascii="Latha" w:hAnsi="Latha" w:cs="Latha"/>
+                <w:sz w:val="28"/>
+                <w:szCs w:val="28"/>
+                <w:cs/>
+                <w:lang w:bidi="ta-IN"/>
+              </w:rPr>
+              <w:t>ன்ன</w:t>
+            </w:r>
+            <w:r>
+              <w:rPr>
+                <w:rFonts w:ascii="BRH Tamil Tab Extra" w:hAnsi="BRH Tamil Tab Extra" w:cs="Latha"/>
+                <w:b/>
+                <w:bCs/>
+                <w:sz w:val="28"/>
+                <w:szCs w:val="24"/>
+                <w:lang w:val="it-IT" w:bidi="ta-IN"/>
+              </w:rPr>
+              <w:t>…</w:t>
+            </w:r>
+            <w:r>
+              <w:rPr>
+                <w:rFonts w:ascii="Latha" w:hAnsi="Latha" w:cs="Latha"/>
+                <w:sz w:val="28"/>
+                <w:szCs w:val="28"/>
                 <w:cs/>
                 <w:lang w:bidi="ta-IN"/>
               </w:rPr>
@@ -1637,9 +1623,152 @@
                 <w:b/>
                 <w:sz w:val="28"/>
                 <w:szCs w:val="32"/>
+              </w:rPr>
+            </w:pPr>
+            <w:r>
+              <w:rPr>
+                <w:rFonts w:cs="Arial"/>
+                <w:b/>
+                <w:sz w:val="28"/>
+                <w:szCs w:val="32"/>
+              </w:rPr>
+              <w:t>T.S.5.6.</w:t>
+            </w:r>
+            <w:r>
+              <w:rPr>
+                <w:rFonts w:cs="Arial"/>
+                <w:b/>
+                <w:sz w:val="28"/>
+                <w:szCs w:val="32"/>
+              </w:rPr>
+              <w:t>6</w:t>
+            </w:r>
+            <w:r>
+              <w:rPr>
+                <w:rFonts w:cs="Arial"/>
+                <w:b/>
+                <w:sz w:val="28"/>
+                <w:szCs w:val="32"/>
+              </w:rPr>
+              <w:t>.</w:t>
+            </w:r>
+            <w:r>
+              <w:rPr>
+                <w:rFonts w:cs="Arial"/>
+                <w:b/>
+                <w:sz w:val="28"/>
+                <w:szCs w:val="32"/>
+              </w:rPr>
+              <w:t>1</w:t>
+            </w:r>
+            <w:r>
+              <w:rPr>
+                <w:rFonts w:cs="Arial"/>
+                <w:b/>
+                <w:sz w:val="28"/>
+                <w:szCs w:val="32"/>
+              </w:rPr>
+              <w:t xml:space="preserve"> – Kramam</w:t>
+            </w:r>
+          </w:p>
+          <w:p>
+            <w:pPr>
+              <w:widowControl w:val="0"/>
+              <w:tabs>
+                <w:tab w:val="left" w:pos="993"/>
+              </w:tabs>
+              <w:autoSpaceDE w:val="0"/>
+              <w:autoSpaceDN w:val="0"/>
+              <w:adjustRightInd w:val="0"/>
+              <w:spacing w:before="0" w:line="252" w:lineRule="auto"/>
+              <w:ind w:right="297"/>
+              <w:rPr>
+                <w:rFonts w:cs="Arial"/>
+                <w:b/>
+                <w:sz w:val="28"/>
+                <w:szCs w:val="32"/>
+                <w:lang w:val="en-IN"/>
+              </w:rPr>
+            </w:pPr>
+            <w:r>
+              <w:rPr>
+                <w:rFonts w:cs="Arial"/>
+                <w:b/>
+                <w:sz w:val="28"/>
+                <w:szCs w:val="32"/>
+                <w:lang w:val="en-IN"/>
+              </w:rPr>
+              <w:t xml:space="preserve">Krama Vaakyam No.– </w:t>
+            </w:r>
+            <w:r>
+              <w:rPr>
+                <w:rFonts w:cs="Arial"/>
+                <w:b/>
+                <w:sz w:val="28"/>
+                <w:szCs w:val="32"/>
+                <w:lang w:val="en-IN"/>
+              </w:rPr>
+              <w:t>17</w:t>
+            </w:r>
+          </w:p>
+          <w:p>
+            <w:pPr>
+              <w:widowControl w:val="0"/>
+              <w:tabs>
+                <w:tab w:val="left" w:pos="993"/>
+              </w:tabs>
+              <w:autoSpaceDE w:val="0"/>
+              <w:autoSpaceDN w:val="0"/>
+              <w:adjustRightInd w:val="0"/>
+              <w:spacing w:before="0" w:line="252" w:lineRule="auto"/>
+              <w:ind w:right="297"/>
+              <w:rPr>
+                <w:rFonts w:cs="Arial"/>
+                <w:b/>
+                <w:sz w:val="28"/>
+                <w:szCs w:val="32"/>
                 <w:lang w:val="it-IT"/>
               </w:rPr>
             </w:pPr>
+            <w:r>
+              <w:rPr>
+                <w:rFonts w:cs="Arial"/>
+                <w:b/>
+                <w:sz w:val="28"/>
+                <w:szCs w:val="32"/>
+                <w:lang w:val="it-IT"/>
+              </w:rPr>
+              <w:t>Panchaati No</w:t>
+            </w:r>
+            <w:r>
+              <w:rPr>
+                <w:rFonts w:cs="Arial"/>
+                <w:b/>
+                <w:szCs w:val="32"/>
+                <w:lang w:val="it-IT"/>
+              </w:rPr>
+              <w:t>. -</w:t>
+            </w:r>
+            <w:r>
+              <w:rPr>
+                <w:rFonts w:cs="Arial"/>
+                <w:b/>
+                <w:sz w:val="28"/>
+                <w:szCs w:val="28"/>
+                <w:lang w:val="it-IT"/>
+              </w:rPr>
+              <w:t xml:space="preserve"> </w:t>
+            </w:r>
+            <w:r>
+              <w:rPr>
+                <w:rFonts w:cs="Arial"/>
+                <w:b/>
+                <w:sz w:val="28"/>
+                <w:szCs w:val="28"/>
+                <w:lang w:val="it-IT"/>
+              </w:rPr>
+              <w:t>23</w:t>
+            </w:r>
           </w:p>
         </w:tc>
         <w:tc>
@@ -1653,7 +1782,6 @@
               <w:autoSpaceDN w:val="0"/>
               <w:adjustRightInd w:val="0"/>
               <w:spacing w:before="0" w:line="240" w:lineRule="auto"/>
-              <w:jc w:val="center"/>
               <w:rPr>
                 <w:rFonts w:ascii="Latha" w:hAnsi="Latha" w:cs="Latha"/>
                 <w:sz w:val="28"/>
@@ -1662,6 +1790,251 @@
                 <w:lang w:bidi="ta-IN"/>
               </w:rPr>
             </w:pPr>
+            <w:r>
+              <w:rPr>
+                <w:rFonts w:ascii="Latha" w:hAnsi="Latha" w:cs="Latha"/>
+                <w:sz w:val="28"/>
+                <w:szCs w:val="28"/>
+                <w:cs/>
+                <w:lang w:bidi="ta-IN"/>
+              </w:rPr>
+              <w:t>தே</w:t>
+            </w:r>
+            <w:r>
+              <w:rPr>
+                <w:rFonts w:ascii="Latha" w:hAnsi="Latha" w:cs="Latha"/>
+                <w:sz w:val="28"/>
+                <w:szCs w:val="28"/>
+                <w:lang w:bidi="ta-IN"/>
+              </w:rPr>
+              <w:t xml:space="preserve"> </w:t>
+            </w:r>
+            <w:r>
+              <w:rPr>
+                <w:rFonts w:ascii="Latha" w:hAnsi="Latha" w:cs="Latha"/>
+                <w:sz w:val="28"/>
+                <w:szCs w:val="28"/>
+                <w:cs/>
+                <w:lang w:bidi="ta-IN"/>
+              </w:rPr>
+              <w:t>ச</w:t>
+            </w:r>
+            <w:r>
+              <w:rPr>
+                <w:rFonts w:ascii="Latha" w:hAnsi="Latha" w:cs="Latha"/>
+                <w:b/>
+                <w:bCs/>
+                <w:position w:val="-12"/>
+                <w:sz w:val="28"/>
+                <w:szCs w:val="28"/>
+                <w:cs/>
+                <w:lang w:bidi="ta-IN"/>
+              </w:rPr>
+              <w:t>2</w:t>
+            </w:r>
+            <w:r>
+              <w:rPr>
+                <w:rFonts w:ascii="Latha" w:hAnsi="Latha" w:cs="Latha"/>
+                <w:sz w:val="28"/>
+                <w:szCs w:val="28"/>
+                <w:cs/>
+                <w:lang w:bidi="ta-IN"/>
+              </w:rPr>
+              <w:t>ந்தோ</w:t>
+            </w:r>
+            <w:r>
+              <w:rPr>
+                <w:rFonts w:ascii="BRH Tamil Tab Extra" w:hAnsi="BRH Tamil Tab Extra" w:cs="Latha"/>
+                <w:b/>
+                <w:sz w:val="36"/>
+                <w:szCs w:val="28"/>
+                <w:lang w:bidi="ta-IN"/>
+              </w:rPr>
+              <w:t>†</w:t>
+            </w:r>
+            <w:r>
+              <w:rPr>
+                <w:rFonts w:ascii="Latha" w:hAnsi="Latha" w:cs="Latha"/>
+                <w:b/>
+                <w:bCs/>
+                <w:position w:val="-12"/>
+                <w:sz w:val="28"/>
+                <w:szCs w:val="28"/>
+                <w:cs/>
+                <w:lang w:bidi="ta-IN"/>
+              </w:rPr>
+              <w:t>3</w:t>
+            </w:r>
+            <w:r>
+              <w:rPr>
+                <w:rFonts w:ascii="Latha" w:hAnsi="Latha" w:cs="Latha"/>
+                <w:sz w:val="28"/>
+                <w:szCs w:val="28"/>
+                <w:cs/>
+                <w:lang w:bidi="ta-IN"/>
+              </w:rPr>
+              <w:t>பி</w:t>
+            </w:r>
+            <w:r>
+              <w:rPr>
+                <w:rFonts w:ascii="Latha" w:hAnsi="Latha" w:cs="Latha"/>
+                <w:b/>
+                <w:bCs/>
+                <w:position w:val="-12"/>
+                <w:sz w:val="28"/>
+                <w:szCs w:val="28"/>
+                <w:cs/>
+                <w:lang w:bidi="ta-IN"/>
+              </w:rPr>
+              <w:t>4</w:t>
+            </w:r>
+            <w:r>
+              <w:rPr>
+                <w:rFonts w:ascii="Latha" w:hAnsi="Latha" w:cs="Latha"/>
+                <w:b/>
+                <w:bCs/>
+                <w:sz w:val="32"/>
+                <w:szCs w:val="32"/>
+                <w:cs/>
+                <w:lang w:bidi="ta-IN"/>
+              </w:rPr>
+              <w:t>:</w:t>
+            </w:r>
+            <w:r>
+              <w:rPr>
+                <w:rFonts w:ascii="Latha" w:hAnsi="Latha" w:cs="Latha"/>
+                <w:sz w:val="28"/>
+                <w:szCs w:val="28"/>
+                <w:lang w:bidi="ta-IN"/>
+              </w:rPr>
+              <w:t xml:space="preserve"> | </w:t>
+            </w:r>
+            <w:r>
+              <w:rPr>
+                <w:rFonts w:ascii="Latha" w:hAnsi="Latha" w:cs="Latha"/>
+                <w:sz w:val="28"/>
+                <w:szCs w:val="28"/>
+                <w:cs/>
+                <w:lang w:bidi="ta-IN"/>
+              </w:rPr>
+              <w:t>ச</w:t>
+            </w:r>
+            <w:r>
+              <w:rPr>
+                <w:rFonts w:ascii="Latha" w:hAnsi="Latha" w:cs="Latha"/>
+                <w:b/>
+                <w:bCs/>
+                <w:position w:val="-12"/>
+                <w:sz w:val="28"/>
+                <w:szCs w:val="28"/>
+                <w:cs/>
+                <w:lang w:bidi="ta-IN"/>
+              </w:rPr>
+              <w:t>2</w:t>
+            </w:r>
+            <w:r>
+              <w:rPr>
+                <w:rFonts w:ascii="Latha" w:hAnsi="Latha" w:cs="Latha"/>
+                <w:sz w:val="28"/>
+                <w:szCs w:val="28"/>
+                <w:highlight w:val="yellow"/>
+                <w:cs/>
+                <w:lang w:bidi="ta-IN"/>
+              </w:rPr>
+              <w:t>னோ</w:t>
+            </w:r>
+            <w:r>
+              <w:rPr>
+                <w:rFonts w:ascii="BRH Tamil Tab Extra" w:hAnsi="BRH Tamil Tab Extra" w:cs="Latha"/>
+                <w:b/>
+                <w:sz w:val="36"/>
+                <w:szCs w:val="28"/>
+                <w:lang w:bidi="ta-IN"/>
+              </w:rPr>
+              <w:t>†</w:t>
+            </w:r>
+            <w:r>
+              <w:rPr>
+                <w:rFonts w:ascii="Latha" w:hAnsi="Latha" w:cs="Latha"/>
+                <w:sz w:val="28"/>
+                <w:szCs w:val="28"/>
+                <w:cs/>
+                <w:lang w:bidi="ta-IN"/>
+              </w:rPr>
+              <w:t>பி</w:t>
+            </w:r>
+            <w:r>
+              <w:rPr>
+                <w:rFonts w:ascii="Latha" w:hAnsi="Latha" w:cs="Latha"/>
+                <w:b/>
+                <w:bCs/>
+                <w:position w:val="-12"/>
+                <w:sz w:val="28"/>
+                <w:szCs w:val="28"/>
+                <w:cs/>
+                <w:lang w:bidi="ta-IN"/>
+              </w:rPr>
+              <w:t>4</w:t>
+            </w:r>
+            <w:r>
+              <w:rPr>
+                <w:rFonts w:ascii="Latha" w:hAnsi="Latha" w:cs="Latha"/>
+                <w:sz w:val="28"/>
+                <w:szCs w:val="28"/>
+                <w:cs/>
+                <w:lang w:bidi="ta-IN"/>
+              </w:rPr>
+              <w:t>ரா</w:t>
+            </w:r>
+            <w:r>
+              <w:rPr>
+                <w:rFonts w:ascii="BRH Tamil Tab Extra" w:hAnsi="BRH Tamil Tab Extra" w:cs="Latha"/>
+                <w:b/>
+                <w:sz w:val="32"/>
+                <w:szCs w:val="28"/>
+                <w:lang w:bidi="ta-IN"/>
+              </w:rPr>
+              <w:t>…</w:t>
+            </w:r>
+            <w:r>
+              <w:rPr>
+                <w:rFonts w:ascii="Latha" w:hAnsi="Latha" w:cs="Latha"/>
+                <w:sz w:val="28"/>
+                <w:szCs w:val="28"/>
+                <w:cs/>
+                <w:lang w:bidi="ta-IN"/>
+              </w:rPr>
+              <w:t>த்மான</w:t>
+            </w:r>
+            <w:r>
+              <w:rPr>
+                <w:rFonts w:ascii="BRH Tamil Tab Extra" w:hAnsi="BRH Tamil Tab Extra" w:cs="Latha"/>
+                <w:b/>
+                <w:sz w:val="36"/>
+                <w:szCs w:val="28"/>
+                <w:lang w:bidi="ta-IN"/>
+              </w:rPr>
+              <w:t>‡</w:t>
+            </w:r>
+            <w:r>
+              <w:rPr>
+                <w:rFonts w:ascii="Latha" w:hAnsi="Latha" w:cs="Latha"/>
+                <w:sz w:val="28"/>
+                <w:szCs w:val="28"/>
+                <w:cs/>
+                <w:lang w:bidi="ta-IN"/>
+              </w:rPr>
+              <w:t>ம்</w:t>
+            </w:r>
+            <w:r>
+              <w:rPr>
+                <w:rFonts w:ascii="Latha" w:hAnsi="Latha" w:cs="Latha"/>
+                <w:sz w:val="28"/>
+                <w:szCs w:val="28"/>
+                <w:lang w:bidi="ta-IN"/>
+              </w:rPr>
+              <w:t xml:space="preserve"> |</w:t>
+            </w:r>
           </w:p>
         </w:tc>
         <w:tc>
@@ -1675,7 +2048,6 @@
               <w:autoSpaceDN w:val="0"/>
               <w:adjustRightInd w:val="0"/>
               <w:spacing w:before="0" w:line="240" w:lineRule="auto"/>
-              <w:jc w:val="center"/>
               <w:rPr>
                 <w:rFonts w:ascii="Latha" w:hAnsi="Latha" w:cs="Latha"/>
                 <w:sz w:val="28"/>
@@ -1684,6 +2056,1073 @@
                 <w:lang w:bidi="ta-IN"/>
               </w:rPr>
             </w:pPr>
+            <w:r>
+              <w:rPr>
+                <w:rFonts w:ascii="Latha" w:hAnsi="Latha" w:cs="Latha"/>
+                <w:sz w:val="28"/>
+                <w:szCs w:val="28"/>
+                <w:cs/>
+                <w:lang w:bidi="ta-IN"/>
+              </w:rPr>
+              <w:t>தே</w:t>
+            </w:r>
+            <w:r>
+              <w:rPr>
+                <w:rFonts w:ascii="Latha" w:hAnsi="Latha" w:cs="Latha"/>
+                <w:sz w:val="28"/>
+                <w:szCs w:val="28"/>
+                <w:lang w:bidi="ta-IN"/>
+              </w:rPr>
+              <w:t xml:space="preserve"> </w:t>
+            </w:r>
+            <w:r>
+              <w:rPr>
+                <w:rFonts w:ascii="Latha" w:hAnsi="Latha" w:cs="Latha"/>
+                <w:sz w:val="28"/>
+                <w:szCs w:val="28"/>
+                <w:cs/>
+                <w:lang w:bidi="ta-IN"/>
+              </w:rPr>
+              <w:t>ச</w:t>
+            </w:r>
+            <w:r>
+              <w:rPr>
+                <w:rFonts w:ascii="Latha" w:hAnsi="Latha" w:cs="Latha"/>
+                <w:b/>
+                <w:bCs/>
+                <w:position w:val="-12"/>
+                <w:sz w:val="28"/>
+                <w:szCs w:val="28"/>
+                <w:cs/>
+                <w:lang w:bidi="ta-IN"/>
+              </w:rPr>
+              <w:t>2</w:t>
+            </w:r>
+            <w:r>
+              <w:rPr>
+                <w:rFonts w:ascii="Latha" w:hAnsi="Latha" w:cs="Latha"/>
+                <w:sz w:val="28"/>
+                <w:szCs w:val="28"/>
+                <w:cs/>
+                <w:lang w:bidi="ta-IN"/>
+              </w:rPr>
+              <w:t>ந்தோ</w:t>
+            </w:r>
+            <w:r>
+              <w:rPr>
+                <w:rFonts w:ascii="BRH Tamil Tab Extra" w:hAnsi="BRH Tamil Tab Extra" w:cs="Latha"/>
+                <w:b/>
+                <w:sz w:val="36"/>
+                <w:szCs w:val="28"/>
+                <w:lang w:bidi="ta-IN"/>
+              </w:rPr>
+              <w:t>†</w:t>
+            </w:r>
+            <w:r>
+              <w:rPr>
+                <w:rFonts w:ascii="Latha" w:hAnsi="Latha" w:cs="Latha"/>
+                <w:b/>
+                <w:bCs/>
+                <w:position w:val="-12"/>
+                <w:sz w:val="28"/>
+                <w:szCs w:val="28"/>
+                <w:cs/>
+                <w:lang w:bidi="ta-IN"/>
+              </w:rPr>
+              <w:t>3</w:t>
+            </w:r>
+            <w:r>
+              <w:rPr>
+                <w:rFonts w:ascii="Latha" w:hAnsi="Latha" w:cs="Latha"/>
+                <w:sz w:val="28"/>
+                <w:szCs w:val="28"/>
+                <w:cs/>
+                <w:lang w:bidi="ta-IN"/>
+              </w:rPr>
+              <w:t>பி</w:t>
+            </w:r>
+            <w:r>
+              <w:rPr>
+                <w:rFonts w:ascii="Latha" w:hAnsi="Latha" w:cs="Latha"/>
+                <w:b/>
+                <w:bCs/>
+                <w:position w:val="-12"/>
+                <w:sz w:val="28"/>
+                <w:szCs w:val="28"/>
+                <w:cs/>
+                <w:lang w:bidi="ta-IN"/>
+              </w:rPr>
+              <w:t>4</w:t>
+            </w:r>
+            <w:r>
+              <w:rPr>
+                <w:rFonts w:ascii="Latha" w:hAnsi="Latha" w:cs="Latha"/>
+                <w:b/>
+                <w:bCs/>
+                <w:sz w:val="32"/>
+                <w:szCs w:val="32"/>
+                <w:cs/>
+                <w:lang w:bidi="ta-IN"/>
+              </w:rPr>
+              <w:t>:</w:t>
+            </w:r>
+            <w:r>
+              <w:rPr>
+                <w:rFonts w:ascii="Latha" w:hAnsi="Latha" w:cs="Latha"/>
+                <w:sz w:val="28"/>
+                <w:szCs w:val="28"/>
+                <w:lang w:bidi="ta-IN"/>
+              </w:rPr>
+              <w:t xml:space="preserve"> | </w:t>
+            </w:r>
+            <w:r>
+              <w:rPr>
+                <w:rFonts w:ascii="Latha" w:hAnsi="Latha" w:cs="Latha"/>
+                <w:sz w:val="28"/>
+                <w:szCs w:val="28"/>
+                <w:cs/>
+                <w:lang w:bidi="ta-IN"/>
+              </w:rPr>
+              <w:t>ச</w:t>
+            </w:r>
+            <w:r>
+              <w:rPr>
+                <w:rFonts w:ascii="Latha" w:hAnsi="Latha" w:cs="Latha"/>
+                <w:b/>
+                <w:bCs/>
+                <w:position w:val="-12"/>
+                <w:sz w:val="28"/>
+                <w:szCs w:val="28"/>
+                <w:cs/>
+                <w:lang w:bidi="ta-IN"/>
+              </w:rPr>
+              <w:t>2</w:t>
+            </w:r>
+            <w:r>
+              <w:rPr>
+                <w:rFonts w:ascii="Latha" w:hAnsi="Latha" w:cs="Latha"/>
+                <w:sz w:val="28"/>
+                <w:szCs w:val="28"/>
+                <w:highlight w:val="green"/>
+                <w:cs/>
+                <w:lang w:bidi="ta-IN"/>
+              </w:rPr>
+              <w:t>ந்தோ</w:t>
+            </w:r>
+            <w:r>
+              <w:rPr>
+                <w:rFonts w:ascii="BRH Tamil Tab Extra" w:hAnsi="BRH Tamil Tab Extra" w:cs="Latha"/>
+                <w:b/>
+                <w:sz w:val="36"/>
+                <w:szCs w:val="28"/>
+                <w:lang w:bidi="ta-IN"/>
+              </w:rPr>
+              <w:t>†</w:t>
+            </w:r>
+            <w:r>
+              <w:rPr>
+                <w:rFonts w:ascii="Latha" w:hAnsi="Latha" w:cs="Latha"/>
+                <w:sz w:val="28"/>
+                <w:szCs w:val="28"/>
+                <w:cs/>
+                <w:lang w:bidi="ta-IN"/>
+              </w:rPr>
+              <w:t>பி</w:t>
+            </w:r>
+            <w:r>
+              <w:rPr>
+                <w:rFonts w:ascii="Latha" w:hAnsi="Latha" w:cs="Latha"/>
+                <w:b/>
+                <w:bCs/>
+                <w:position w:val="-12"/>
+                <w:sz w:val="28"/>
+                <w:szCs w:val="28"/>
+                <w:cs/>
+                <w:lang w:bidi="ta-IN"/>
+              </w:rPr>
+              <w:t>4</w:t>
+            </w:r>
+            <w:r>
+              <w:rPr>
+                <w:rFonts w:ascii="Latha" w:hAnsi="Latha" w:cs="Latha"/>
+                <w:sz w:val="28"/>
+                <w:szCs w:val="28"/>
+                <w:cs/>
+                <w:lang w:bidi="ta-IN"/>
+              </w:rPr>
+              <w:t>ரா</w:t>
+            </w:r>
+            <w:r>
+              <w:rPr>
+                <w:rFonts w:ascii="BRH Tamil Tab Extra" w:hAnsi="BRH Tamil Tab Extra" w:cs="Latha"/>
+                <w:b/>
+                <w:sz w:val="32"/>
+                <w:szCs w:val="28"/>
+                <w:lang w:bidi="ta-IN"/>
+              </w:rPr>
+              <w:t>…</w:t>
+            </w:r>
+            <w:r>
+              <w:rPr>
+                <w:rFonts w:ascii="Latha" w:hAnsi="Latha" w:cs="Latha"/>
+                <w:sz w:val="28"/>
+                <w:szCs w:val="28"/>
+                <w:cs/>
+                <w:lang w:bidi="ta-IN"/>
+              </w:rPr>
+              <w:t>த்மான</w:t>
+            </w:r>
+            <w:r>
+              <w:rPr>
+                <w:rFonts w:ascii="BRH Tamil Tab Extra" w:hAnsi="BRH Tamil Tab Extra" w:cs="Latha"/>
+                <w:b/>
+                <w:sz w:val="36"/>
+                <w:szCs w:val="28"/>
+                <w:lang w:bidi="ta-IN"/>
+              </w:rPr>
+              <w:t>‡</w:t>
+            </w:r>
+            <w:r>
+              <w:rPr>
+                <w:rFonts w:ascii="Latha" w:hAnsi="Latha" w:cs="Latha"/>
+                <w:sz w:val="28"/>
+                <w:szCs w:val="28"/>
+                <w:cs/>
+                <w:lang w:bidi="ta-IN"/>
+              </w:rPr>
+              <w:t>ம்</w:t>
+            </w:r>
+            <w:r>
+              <w:rPr>
+                <w:rFonts w:ascii="Latha" w:hAnsi="Latha" w:cs="Latha"/>
+                <w:sz w:val="28"/>
+                <w:szCs w:val="28"/>
+                <w:lang w:bidi="ta-IN"/>
+              </w:rPr>
+              <w:t xml:space="preserve"> |</w:t>
+            </w:r>
+          </w:p>
+        </w:tc>
+      </w:tr>
+      <w:tr>
+        <w:trPr>
+          <w:trHeight w:val="918"/>
+        </w:trPr>
+        <w:tc>
+          <w:tcPr>
+            <w:tcW w:w="4048" w:type="dxa"/>
+          </w:tcPr>
+          <w:p>
+            <w:pPr>
+              <w:widowControl w:val="0"/>
+              <w:tabs>
+                <w:tab w:val="left" w:pos="993"/>
+              </w:tabs>
+              <w:autoSpaceDE w:val="0"/>
+              <w:autoSpaceDN w:val="0"/>
+              <w:adjustRightInd w:val="0"/>
+              <w:spacing w:before="0" w:line="252" w:lineRule="auto"/>
+              <w:ind w:right="297"/>
+              <w:rPr>
+                <w:rFonts w:cs="Arial"/>
+                <w:b/>
+                <w:sz w:val="28"/>
+                <w:szCs w:val="32"/>
+              </w:rPr>
+            </w:pPr>
+            <w:r>
+              <w:rPr>
+                <w:rFonts w:cs="Arial"/>
+                <w:b/>
+                <w:sz w:val="28"/>
+                <w:szCs w:val="32"/>
+              </w:rPr>
+              <w:t>T.S.5.6.</w:t>
+            </w:r>
+            <w:r>
+              <w:rPr>
+                <w:rFonts w:cs="Arial"/>
+                <w:b/>
+                <w:sz w:val="28"/>
+                <w:szCs w:val="32"/>
+              </w:rPr>
+              <w:t>17</w:t>
+            </w:r>
+            <w:r>
+              <w:rPr>
+                <w:rFonts w:cs="Arial"/>
+                <w:b/>
+                <w:sz w:val="28"/>
+                <w:szCs w:val="32"/>
+              </w:rPr>
+              <w:t>.1</w:t>
+            </w:r>
+            <w:r>
+              <w:rPr>
+                <w:rFonts w:cs="Arial"/>
+                <w:b/>
+                <w:sz w:val="28"/>
+                <w:szCs w:val="32"/>
+              </w:rPr>
+              <w:t xml:space="preserve"> – Kramam</w:t>
+            </w:r>
+          </w:p>
+          <w:p>
+            <w:pPr>
+              <w:widowControl w:val="0"/>
+              <w:tabs>
+                <w:tab w:val="left" w:pos="993"/>
+              </w:tabs>
+              <w:autoSpaceDE w:val="0"/>
+              <w:autoSpaceDN w:val="0"/>
+              <w:adjustRightInd w:val="0"/>
+              <w:spacing w:before="0" w:line="252" w:lineRule="auto"/>
+              <w:ind w:right="297"/>
+              <w:rPr>
+                <w:rFonts w:cs="Arial"/>
+                <w:b/>
+                <w:sz w:val="28"/>
+                <w:szCs w:val="32"/>
+                <w:lang w:val="en-IN"/>
+              </w:rPr>
+            </w:pPr>
+            <w:r>
+              <w:rPr>
+                <w:rFonts w:cs="Arial"/>
+                <w:b/>
+                <w:sz w:val="28"/>
+                <w:szCs w:val="32"/>
+                <w:lang w:val="en-IN"/>
+              </w:rPr>
+              <w:t xml:space="preserve">Krama Vaakyam No.– </w:t>
+            </w:r>
+            <w:r>
+              <w:rPr>
+                <w:rFonts w:cs="Arial"/>
+                <w:b/>
+                <w:sz w:val="28"/>
+                <w:szCs w:val="32"/>
+                <w:lang w:val="en-IN"/>
+              </w:rPr>
+              <w:t>21,22</w:t>
+            </w:r>
+          </w:p>
+          <w:p>
+            <w:pPr>
+              <w:widowControl w:val="0"/>
+              <w:tabs>
+                <w:tab w:val="left" w:pos="993"/>
+              </w:tabs>
+              <w:autoSpaceDE w:val="0"/>
+              <w:autoSpaceDN w:val="0"/>
+              <w:adjustRightInd w:val="0"/>
+              <w:spacing w:before="0" w:line="252" w:lineRule="auto"/>
+              <w:ind w:right="297"/>
+              <w:rPr>
+                <w:rFonts w:cs="Arial"/>
+                <w:b/>
+                <w:sz w:val="28"/>
+                <w:szCs w:val="32"/>
+              </w:rPr>
+            </w:pPr>
+            <w:r>
+              <w:rPr>
+                <w:rFonts w:cs="Arial"/>
+                <w:b/>
+                <w:sz w:val="28"/>
+                <w:szCs w:val="32"/>
+                <w:lang w:val="it-IT"/>
+              </w:rPr>
+              <w:t>Panchaati No</w:t>
+            </w:r>
+            <w:r>
+              <w:rPr>
+                <w:rFonts w:cs="Arial"/>
+                <w:b/>
+                <w:szCs w:val="32"/>
+                <w:lang w:val="it-IT"/>
+              </w:rPr>
+              <w:t>. -</w:t>
+            </w:r>
+            <w:r>
+              <w:rPr>
+                <w:rFonts w:cs="Arial"/>
+                <w:b/>
+                <w:sz w:val="28"/>
+                <w:szCs w:val="28"/>
+                <w:lang w:val="it-IT"/>
+              </w:rPr>
+              <w:t xml:space="preserve"> </w:t>
+            </w:r>
+            <w:r>
+              <w:rPr>
+                <w:rFonts w:cs="Arial"/>
+                <w:b/>
+                <w:sz w:val="28"/>
+                <w:szCs w:val="28"/>
+                <w:lang w:val="it-IT"/>
+              </w:rPr>
+              <w:t>48</w:t>
+            </w:r>
+          </w:p>
+        </w:tc>
+        <w:tc>
+          <w:tcPr>
+            <w:tcW w:w="4819" w:type="dxa"/>
+          </w:tcPr>
+          <w:p>
+            <w:pPr>
+              <w:widowControl w:val="0"/>
+              <w:autoSpaceDE w:val="0"/>
+              <w:autoSpaceDN w:val="0"/>
+              <w:adjustRightInd w:val="0"/>
+              <w:spacing w:before="0" w:line="240" w:lineRule="auto"/>
+              <w:rPr>
+                <w:rFonts w:ascii="Latha" w:hAnsi="Latha" w:cs="Latha"/>
+                <w:sz w:val="28"/>
+                <w:szCs w:val="28"/>
+                <w:cs/>
+                <w:lang w:bidi="ta-IN"/>
+              </w:rPr>
+            </w:pPr>
+            <w:r>
+              <w:rPr>
+                <w:rFonts w:ascii="Latha" w:hAnsi="Latha" w:cs="Latha"/>
+                <w:sz w:val="28"/>
+                <w:szCs w:val="28"/>
+                <w:cs/>
+                <w:lang w:bidi="ta-IN"/>
+              </w:rPr>
+              <w:t>தி</w:t>
+            </w:r>
+            <w:r>
+              <w:rPr>
+                <w:rFonts w:ascii="BRH Tamil Tab Extra" w:hAnsi="BRH Tamil Tab Extra" w:cs="Latha"/>
+                <w:b/>
+                <w:sz w:val="32"/>
+                <w:szCs w:val="28"/>
+                <w:lang w:bidi="ta-IN"/>
+              </w:rPr>
+              <w:t>…</w:t>
+            </w:r>
+            <w:r>
+              <w:rPr>
+                <w:rFonts w:ascii="Latha" w:hAnsi="Latha" w:cs="Latha"/>
+                <w:sz w:val="28"/>
+                <w:szCs w:val="28"/>
+                <w:cs/>
+                <w:lang w:bidi="ta-IN"/>
+              </w:rPr>
+              <w:t>ஸ்ர</w:t>
+            </w:r>
+            <w:r>
+              <w:rPr>
+                <w:rFonts w:ascii="Latha" w:hAnsi="Latha" w:cs="Latha"/>
+                <w:b/>
+                <w:bCs/>
+                <w:sz w:val="32"/>
+                <w:szCs w:val="32"/>
+                <w:cs/>
+                <w:lang w:bidi="ta-IN"/>
+              </w:rPr>
+              <w:t>:</w:t>
+            </w:r>
+            <w:r>
+              <w:rPr>
+                <w:rFonts w:ascii="Latha" w:hAnsi="Latha" w:cs="Latha"/>
+                <w:sz w:val="28"/>
+                <w:szCs w:val="28"/>
+                <w:lang w:bidi="ta-IN"/>
+              </w:rPr>
+              <w:t xml:space="preserve"> </w:t>
+            </w:r>
+            <w:r>
+              <w:rPr>
+                <w:rFonts w:ascii="Latha" w:hAnsi="Latha" w:cs="Latha"/>
+                <w:sz w:val="28"/>
+                <w:szCs w:val="28"/>
+                <w:cs/>
+                <w:lang w:bidi="ta-IN"/>
+              </w:rPr>
+              <w:t>ப</w:t>
+            </w:r>
+            <w:r>
+              <w:rPr>
+                <w:rFonts w:ascii="BRH Tamil Tab Extra" w:hAnsi="BRH Tamil Tab Extra" w:cs="Latha"/>
+                <w:b/>
+                <w:sz w:val="36"/>
+                <w:szCs w:val="28"/>
+                <w:lang w:bidi="ta-IN"/>
+              </w:rPr>
+              <w:t>†</w:t>
+            </w:r>
+            <w:r>
+              <w:rPr>
+                <w:rFonts w:ascii="Latha" w:hAnsi="Latha" w:cs="Latha"/>
+                <w:sz w:val="28"/>
+                <w:szCs w:val="28"/>
+                <w:cs/>
+                <w:lang w:bidi="ta-IN"/>
+              </w:rPr>
+              <w:t>ஷ்</w:t>
+            </w:r>
+            <w:r>
+              <w:rPr>
+                <w:rFonts w:ascii="Latha" w:hAnsi="Latha" w:cs="Latha"/>
+                <w:sz w:val="28"/>
+                <w:szCs w:val="28"/>
+                <w:highlight w:val="yellow"/>
+                <w:cs/>
+                <w:lang w:bidi="ta-IN"/>
+              </w:rPr>
+              <w:t>ட</w:t>
+            </w:r>
+            <w:r>
+              <w:rPr>
+                <w:rFonts w:ascii="Latha" w:hAnsi="Latha" w:cs="Latha"/>
+                <w:b/>
+                <w:bCs/>
+                <w:position w:val="-12"/>
+                <w:sz w:val="28"/>
+                <w:szCs w:val="28"/>
+                <w:highlight w:val="yellow"/>
+                <w:cs/>
+                <w:lang w:bidi="ta-IN"/>
+              </w:rPr>
+              <w:t>2</w:t>
+            </w:r>
+            <w:r>
+              <w:rPr>
+                <w:rFonts w:ascii="Latha" w:hAnsi="Latha" w:cs="Latha"/>
+                <w:sz w:val="28"/>
+                <w:szCs w:val="28"/>
+                <w:highlight w:val="yellow"/>
+                <w:cs/>
+                <w:lang w:bidi="ta-IN"/>
+              </w:rPr>
+              <w:t>உ</w:t>
+            </w:r>
+            <w:r>
+              <w:rPr>
+                <w:rFonts w:ascii="BRH Tamil Tab Extra" w:hAnsi="BRH Tamil Tab Extra" w:cs="Latha"/>
+                <w:b/>
+                <w:sz w:val="32"/>
+                <w:szCs w:val="28"/>
+                <w:highlight w:val="yellow"/>
+                <w:lang w:bidi="ta-IN"/>
+              </w:rPr>
+              <w:t>…</w:t>
+            </w:r>
+            <w:r>
+              <w:rPr>
+                <w:rFonts w:ascii="Latha" w:hAnsi="Latha" w:cs="Latha"/>
+                <w:sz w:val="28"/>
+                <w:szCs w:val="28"/>
+                <w:cs/>
+                <w:lang w:bidi="ta-IN"/>
+              </w:rPr>
+              <w:t>ஹ்ய</w:t>
+            </w:r>
+            <w:r>
+              <w:rPr>
+                <w:rFonts w:ascii="BRH Tamil Tab Extra" w:hAnsi="BRH Tamil Tab Extra" w:cs="Latha"/>
+                <w:b/>
+                <w:sz w:val="36"/>
+                <w:szCs w:val="28"/>
+                <w:lang w:bidi="ta-IN"/>
+              </w:rPr>
+              <w:t>†</w:t>
+            </w:r>
+            <w:r>
+              <w:rPr>
+                <w:rFonts w:ascii="Latha" w:hAnsi="Latha" w:cs="Latha"/>
+                <w:b/>
+                <w:bCs/>
+                <w:sz w:val="32"/>
+                <w:szCs w:val="32"/>
+                <w:cs/>
+                <w:lang w:bidi="ta-IN"/>
+              </w:rPr>
+              <w:t>:</w:t>
+            </w:r>
+            <w:r>
+              <w:rPr>
+                <w:rFonts w:ascii="Latha" w:hAnsi="Latha" w:cs="Latha"/>
+                <w:sz w:val="28"/>
+                <w:szCs w:val="28"/>
+                <w:lang w:bidi="ta-IN"/>
+              </w:rPr>
+              <w:t xml:space="preserve"> | </w:t>
+            </w:r>
+            <w:r>
+              <w:rPr>
+                <w:rFonts w:ascii="Latha" w:hAnsi="Latha" w:cs="Latha"/>
+                <w:sz w:val="28"/>
+                <w:szCs w:val="28"/>
+                <w:cs/>
+                <w:lang w:bidi="ta-IN"/>
+              </w:rPr>
+              <w:t>ப</w:t>
+            </w:r>
+            <w:r>
+              <w:rPr>
+                <w:rFonts w:ascii="BRH Tamil Tab Extra" w:hAnsi="BRH Tamil Tab Extra" w:cs="Latha"/>
+                <w:b/>
+                <w:sz w:val="32"/>
+                <w:szCs w:val="28"/>
+                <w:lang w:bidi="ta-IN"/>
+              </w:rPr>
+              <w:t>…</w:t>
+            </w:r>
+            <w:r>
+              <w:rPr>
+                <w:rFonts w:ascii="Latha" w:hAnsi="Latha" w:cs="Latha"/>
+                <w:sz w:val="28"/>
+                <w:szCs w:val="28"/>
+                <w:cs/>
+                <w:lang w:bidi="ta-IN"/>
+              </w:rPr>
+              <w:t>ஷ்</w:t>
+            </w:r>
+            <w:r>
+              <w:rPr>
+                <w:rFonts w:ascii="Latha" w:hAnsi="Latha" w:cs="Latha"/>
+                <w:sz w:val="28"/>
+                <w:szCs w:val="28"/>
+                <w:highlight w:val="yellow"/>
+                <w:cs/>
+                <w:lang w:bidi="ta-IN"/>
+              </w:rPr>
+              <w:t>ட</w:t>
+            </w:r>
+            <w:r>
+              <w:rPr>
+                <w:rFonts w:ascii="Latha" w:hAnsi="Latha" w:cs="Latha"/>
+                <w:b/>
+                <w:bCs/>
+                <w:position w:val="-12"/>
+                <w:sz w:val="28"/>
+                <w:szCs w:val="28"/>
+                <w:highlight w:val="yellow"/>
+                <w:cs/>
+                <w:lang w:bidi="ta-IN"/>
+              </w:rPr>
+              <w:t>2</w:t>
+            </w:r>
+            <w:r>
+              <w:rPr>
+                <w:rFonts w:ascii="Latha" w:hAnsi="Latha" w:cs="Latha"/>
+                <w:sz w:val="28"/>
+                <w:szCs w:val="28"/>
+                <w:highlight w:val="yellow"/>
+                <w:cs/>
+                <w:lang w:bidi="ta-IN"/>
+              </w:rPr>
+              <w:t>உ</w:t>
+            </w:r>
+            <w:r>
+              <w:rPr>
+                <w:rFonts w:ascii="BRH Tamil Tab Extra" w:hAnsi="BRH Tamil Tab Extra" w:cs="Latha"/>
+                <w:b/>
+                <w:sz w:val="32"/>
+                <w:szCs w:val="28"/>
+                <w:lang w:bidi="ta-IN"/>
+              </w:rPr>
+              <w:t>…</w:t>
+            </w:r>
+            <w:r>
+              <w:rPr>
+                <w:rFonts w:ascii="Latha" w:hAnsi="Latha" w:cs="Latha"/>
+                <w:sz w:val="28"/>
+                <w:szCs w:val="28"/>
+                <w:cs/>
+                <w:lang w:bidi="ta-IN"/>
+              </w:rPr>
+              <w:t>ஹ்யோ</w:t>
+            </w:r>
+            <w:r>
+              <w:rPr>
+                <w:rFonts w:ascii="BRH Tamil Tab Extra" w:hAnsi="BRH Tamil Tab Extra" w:cs="Latha"/>
+                <w:b/>
+                <w:sz w:val="36"/>
+                <w:szCs w:val="28"/>
+                <w:lang w:bidi="ta-IN"/>
+              </w:rPr>
+              <w:t>†</w:t>
+            </w:r>
+            <w:r>
+              <w:rPr>
+                <w:rFonts w:ascii="Latha" w:hAnsi="Latha" w:cs="Latha"/>
+                <w:sz w:val="28"/>
+                <w:szCs w:val="28"/>
+                <w:lang w:bidi="ta-IN"/>
+              </w:rPr>
+              <w:t xml:space="preserve"> </w:t>
+            </w:r>
+            <w:r>
+              <w:rPr>
+                <w:rFonts w:ascii="Latha" w:hAnsi="Latha" w:cs="Latha"/>
+                <w:sz w:val="28"/>
+                <w:szCs w:val="28"/>
+                <w:cs/>
+                <w:lang w:bidi="ta-IN"/>
+              </w:rPr>
+              <w:t>விஶ்வே</w:t>
+            </w:r>
+            <w:r>
+              <w:rPr>
+                <w:rFonts w:ascii="BRH Tamil Tab Extra" w:hAnsi="BRH Tamil Tab Extra" w:cs="Latha"/>
+                <w:b/>
+                <w:sz w:val="36"/>
+                <w:szCs w:val="28"/>
+                <w:lang w:bidi="ta-IN"/>
+              </w:rPr>
+              <w:t>†</w:t>
+            </w:r>
+            <w:r>
+              <w:rPr>
+                <w:rFonts w:ascii="Latha" w:hAnsi="Latha" w:cs="Latha"/>
+                <w:sz w:val="28"/>
+                <w:szCs w:val="28"/>
+                <w:cs/>
+                <w:lang w:bidi="ta-IN"/>
+              </w:rPr>
+              <w:t>ஷாம்</w:t>
+            </w:r>
+            <w:r>
+              <w:rPr>
+                <w:rFonts w:ascii="Latha" w:hAnsi="Latha" w:cs="Latha"/>
+                <w:sz w:val="28"/>
+                <w:szCs w:val="28"/>
+                <w:lang w:bidi="ta-IN"/>
+              </w:rPr>
+              <w:t xml:space="preserve"> |</w:t>
+            </w:r>
+          </w:p>
+        </w:tc>
+        <w:tc>
+          <w:tcPr>
+            <w:tcW w:w="5103" w:type="dxa"/>
+          </w:tcPr>
+          <w:p>
+            <w:pPr>
+              <w:widowControl w:val="0"/>
+              <w:autoSpaceDE w:val="0"/>
+              <w:autoSpaceDN w:val="0"/>
+              <w:adjustRightInd w:val="0"/>
+              <w:spacing w:before="0" w:line="240" w:lineRule="auto"/>
+              <w:rPr>
+                <w:rFonts w:ascii="Latha" w:hAnsi="Latha" w:cs="Latha"/>
+                <w:sz w:val="28"/>
+                <w:szCs w:val="28"/>
+                <w:cs/>
+                <w:lang w:bidi="ta-IN"/>
+              </w:rPr>
+            </w:pPr>
+            <w:r>
+              <w:rPr>
+                <w:rFonts w:ascii="Latha" w:hAnsi="Latha" w:cs="Latha"/>
+                <w:sz w:val="28"/>
+                <w:szCs w:val="28"/>
+                <w:cs/>
+                <w:lang w:bidi="ta-IN"/>
+              </w:rPr>
+              <w:t>தி</w:t>
+            </w:r>
+            <w:r>
+              <w:rPr>
+                <w:rFonts w:ascii="BRH Tamil Tab Extra" w:hAnsi="BRH Tamil Tab Extra" w:cs="Latha"/>
+                <w:b/>
+                <w:sz w:val="32"/>
+                <w:szCs w:val="28"/>
+                <w:lang w:bidi="ta-IN"/>
+              </w:rPr>
+              <w:t>…</w:t>
+            </w:r>
+            <w:r>
+              <w:rPr>
+                <w:rFonts w:ascii="Latha" w:hAnsi="Latha" w:cs="Latha"/>
+                <w:sz w:val="28"/>
+                <w:szCs w:val="28"/>
+                <w:cs/>
+                <w:lang w:bidi="ta-IN"/>
+              </w:rPr>
+              <w:t>ஸ்ர</w:t>
+            </w:r>
+            <w:r>
+              <w:rPr>
+                <w:rFonts w:ascii="Latha" w:hAnsi="Latha" w:cs="Latha"/>
+                <w:b/>
+                <w:bCs/>
+                <w:sz w:val="32"/>
+                <w:szCs w:val="32"/>
+                <w:cs/>
+                <w:lang w:bidi="ta-IN"/>
+              </w:rPr>
+              <w:t>:</w:t>
+            </w:r>
+            <w:r>
+              <w:rPr>
+                <w:rFonts w:ascii="Latha" w:hAnsi="Latha" w:cs="Latha"/>
+                <w:sz w:val="28"/>
+                <w:szCs w:val="28"/>
+                <w:lang w:bidi="ta-IN"/>
+              </w:rPr>
+              <w:t xml:space="preserve"> </w:t>
+            </w:r>
+            <w:r>
+              <w:rPr>
+                <w:rFonts w:ascii="Latha" w:hAnsi="Latha" w:cs="Latha"/>
+                <w:sz w:val="28"/>
+                <w:szCs w:val="28"/>
+                <w:cs/>
+                <w:lang w:bidi="ta-IN"/>
+              </w:rPr>
+              <w:t>ப</w:t>
+            </w:r>
+            <w:r>
+              <w:rPr>
+                <w:rFonts w:ascii="BRH Tamil Tab Extra" w:hAnsi="BRH Tamil Tab Extra" w:cs="Latha"/>
+                <w:b/>
+                <w:sz w:val="36"/>
+                <w:szCs w:val="28"/>
+                <w:lang w:bidi="ta-IN"/>
+              </w:rPr>
+              <w:t>†</w:t>
+            </w:r>
+            <w:r>
+              <w:rPr>
+                <w:rFonts w:ascii="Latha" w:hAnsi="Latha" w:cs="Latha"/>
+                <w:sz w:val="28"/>
+                <w:szCs w:val="28"/>
+                <w:cs/>
+                <w:lang w:bidi="ta-IN"/>
+              </w:rPr>
+              <w:t>ஷ்</w:t>
+            </w:r>
+            <w:r>
+              <w:rPr>
+                <w:rFonts w:ascii="BRH Tamil Tab Extra" w:hAnsi="BRH Tamil Tab Extra" w:cs="Latha" w:hint="cs"/>
+                <w:b/>
+                <w:sz w:val="32"/>
+                <w:szCs w:val="28"/>
+                <w:highlight w:val="green"/>
+                <w:cs/>
+                <w:lang w:bidi="ta-IN"/>
+              </w:rPr>
+              <w:t>டௌ</w:t>
+            </w:r>
+            <w:r>
+              <w:rPr>
+                <w:rFonts w:ascii="BRH Tamil Tab Extra" w:hAnsi="BRH Tamil Tab Extra" w:cs="Latha"/>
+                <w:b/>
+                <w:sz w:val="32"/>
+                <w:szCs w:val="28"/>
+                <w:highlight w:val="green"/>
+                <w:lang w:bidi="ta-IN"/>
+              </w:rPr>
+              <w:t>…</w:t>
+            </w:r>
+            <w:r>
+              <w:rPr>
+                <w:rFonts w:ascii="Latha" w:hAnsi="Latha" w:cs="Latha"/>
+                <w:b/>
+                <w:bCs/>
+                <w:position w:val="-12"/>
+                <w:sz w:val="28"/>
+                <w:szCs w:val="28"/>
+                <w:highlight w:val="green"/>
+                <w:cs/>
+                <w:lang w:bidi="ta-IN"/>
+              </w:rPr>
+              <w:t>2</w:t>
+            </w:r>
+            <w:r>
+              <w:rPr>
+                <w:rFonts w:ascii="Latha" w:hAnsi="Latha" w:cs="Latha"/>
+                <w:sz w:val="28"/>
+                <w:szCs w:val="28"/>
+                <w:cs/>
+                <w:lang w:bidi="ta-IN"/>
+              </w:rPr>
+              <w:t>ஹ்ய</w:t>
+            </w:r>
+            <w:r>
+              <w:rPr>
+                <w:rFonts w:ascii="BRH Tamil Tab Extra" w:hAnsi="BRH Tamil Tab Extra" w:cs="Latha"/>
+                <w:b/>
+                <w:sz w:val="36"/>
+                <w:szCs w:val="28"/>
+                <w:lang w:bidi="ta-IN"/>
+              </w:rPr>
+              <w:t>†</w:t>
+            </w:r>
+            <w:r>
+              <w:rPr>
+                <w:rFonts w:ascii="Latha" w:hAnsi="Latha" w:cs="Latha"/>
+                <w:b/>
+                <w:bCs/>
+                <w:sz w:val="32"/>
+                <w:szCs w:val="32"/>
+                <w:cs/>
+                <w:lang w:bidi="ta-IN"/>
+              </w:rPr>
+              <w:t>:</w:t>
+            </w:r>
+            <w:r>
+              <w:rPr>
+                <w:rFonts w:ascii="Latha" w:hAnsi="Latha" w:cs="Latha"/>
+                <w:sz w:val="28"/>
+                <w:szCs w:val="28"/>
+                <w:lang w:bidi="ta-IN"/>
+              </w:rPr>
+              <w:t xml:space="preserve"> | </w:t>
+            </w:r>
+            <w:r>
+              <w:rPr>
+                <w:rFonts w:ascii="Latha" w:hAnsi="Latha" w:cs="Latha"/>
+                <w:sz w:val="28"/>
+                <w:szCs w:val="28"/>
+                <w:cs/>
+                <w:lang w:bidi="ta-IN"/>
+              </w:rPr>
+              <w:br/>
+            </w:r>
+            <w:r>
+              <w:rPr>
+                <w:rFonts w:ascii="Latha" w:hAnsi="Latha" w:cs="Latha"/>
+                <w:sz w:val="28"/>
+                <w:szCs w:val="28"/>
+                <w:cs/>
+                <w:lang w:bidi="ta-IN"/>
+              </w:rPr>
+              <w:t>ப</w:t>
+            </w:r>
+            <w:r>
+              <w:rPr>
+                <w:rFonts w:ascii="BRH Tamil Tab Extra" w:hAnsi="BRH Tamil Tab Extra" w:cs="Latha"/>
+                <w:b/>
+                <w:sz w:val="32"/>
+                <w:szCs w:val="28"/>
+                <w:lang w:bidi="ta-IN"/>
+              </w:rPr>
+              <w:t>…</w:t>
+            </w:r>
+            <w:r>
+              <w:rPr>
+                <w:rFonts w:ascii="Latha" w:hAnsi="Latha" w:cs="Latha"/>
+                <w:sz w:val="28"/>
+                <w:szCs w:val="28"/>
+                <w:cs/>
+                <w:lang w:bidi="ta-IN"/>
+              </w:rPr>
+              <w:t>ஷ்</w:t>
+            </w:r>
+            <w:r>
+              <w:rPr>
+                <w:rFonts w:ascii="BRH Tamil Tab Extra" w:hAnsi="BRH Tamil Tab Extra" w:cs="Latha" w:hint="cs"/>
+                <w:b/>
+                <w:sz w:val="32"/>
+                <w:szCs w:val="28"/>
+                <w:highlight w:val="green"/>
+                <w:cs/>
+                <w:lang w:bidi="ta-IN"/>
+              </w:rPr>
+              <w:t>டௌ</w:t>
+            </w:r>
+            <w:r>
+              <w:rPr>
+                <w:rFonts w:ascii="BRH Tamil Tab Extra" w:hAnsi="BRH Tamil Tab Extra" w:cs="Latha"/>
+                <w:b/>
+                <w:sz w:val="32"/>
+                <w:szCs w:val="28"/>
+                <w:highlight w:val="green"/>
+                <w:lang w:bidi="ta-IN"/>
+              </w:rPr>
+              <w:t>……</w:t>
+            </w:r>
+            <w:r>
+              <w:rPr>
+                <w:rFonts w:ascii="Latha" w:hAnsi="Latha" w:cs="Latha"/>
+                <w:b/>
+                <w:bCs/>
+                <w:position w:val="-12"/>
+                <w:sz w:val="28"/>
+                <w:szCs w:val="28"/>
+                <w:highlight w:val="green"/>
+                <w:cs/>
+                <w:lang w:bidi="ta-IN"/>
+              </w:rPr>
+              <w:t>2</w:t>
+            </w:r>
+            <w:r>
+              <w:rPr>
+                <w:rFonts w:ascii="Latha" w:hAnsi="Latha" w:cs="Latha"/>
+                <w:sz w:val="28"/>
+                <w:szCs w:val="28"/>
+                <w:cs/>
+                <w:lang w:bidi="ta-IN"/>
+              </w:rPr>
+              <w:t>ஹ்யோ</w:t>
+            </w:r>
+            <w:r>
+              <w:rPr>
+                <w:rFonts w:ascii="BRH Tamil Tab Extra" w:hAnsi="BRH Tamil Tab Extra" w:cs="Latha"/>
+                <w:b/>
+                <w:sz w:val="36"/>
+                <w:szCs w:val="28"/>
+                <w:lang w:bidi="ta-IN"/>
+              </w:rPr>
+              <w:t>†</w:t>
+            </w:r>
+            <w:r>
+              <w:rPr>
+                <w:rFonts w:ascii="Latha" w:hAnsi="Latha" w:cs="Latha"/>
+                <w:sz w:val="28"/>
+                <w:szCs w:val="28"/>
+                <w:lang w:bidi="ta-IN"/>
+              </w:rPr>
+              <w:t xml:space="preserve"> </w:t>
+            </w:r>
+            <w:r>
+              <w:rPr>
+                <w:rFonts w:ascii="Latha" w:hAnsi="Latha" w:cs="Latha"/>
+                <w:sz w:val="28"/>
+                <w:szCs w:val="28"/>
+                <w:cs/>
+                <w:lang w:bidi="ta-IN"/>
+              </w:rPr>
+              <w:t>விஶ்வே</w:t>
+            </w:r>
+            <w:r>
+              <w:rPr>
+                <w:rFonts w:ascii="BRH Tamil Tab Extra" w:hAnsi="BRH Tamil Tab Extra" w:cs="Latha"/>
+                <w:b/>
+                <w:sz w:val="36"/>
+                <w:szCs w:val="28"/>
+                <w:lang w:bidi="ta-IN"/>
+              </w:rPr>
+              <w:t>†</w:t>
+            </w:r>
+            <w:r>
+              <w:rPr>
+                <w:rFonts w:ascii="Latha" w:hAnsi="Latha" w:cs="Latha"/>
+                <w:sz w:val="28"/>
+                <w:szCs w:val="28"/>
+                <w:cs/>
+                <w:lang w:bidi="ta-IN"/>
+              </w:rPr>
+              <w:t>ஷாம்</w:t>
+            </w:r>
+            <w:r>
+              <w:rPr>
+                <w:rFonts w:ascii="Latha" w:hAnsi="Latha" w:cs="Latha"/>
+                <w:sz w:val="28"/>
+                <w:szCs w:val="28"/>
+                <w:lang w:bidi="ta-IN"/>
+              </w:rPr>
+              <w:t xml:space="preserve"> |</w:t>
+            </w:r>
           </w:p>
         </w:tc>
       </w:tr>
@@ -1762,84 +3201,6 @@
           <w:u w:val="single"/>
         </w:rPr>
       </w:pPr>
-    </w:p>
-    <w:p>
-      <w:pPr>
-        <w:spacing w:before="0" w:line="240" w:lineRule="auto"/>
-        <w:jc w:val="center"/>
-        <w:rPr>
-          <w:b/>
-          <w:bCs/>
-          <w:sz w:val="32"/>
-          <w:szCs w:val="32"/>
-          <w:u w:val="single"/>
-        </w:rPr>
-      </w:pPr>
-    </w:p>
-    <w:p>
-      <w:pPr>
-        <w:spacing w:before="0" w:line="240" w:lineRule="auto"/>
-        <w:jc w:val="center"/>
-        <w:rPr>
-          <w:b/>
-          <w:bCs/>
-          <w:sz w:val="32"/>
-          <w:szCs w:val="32"/>
-          <w:u w:val="single"/>
-        </w:rPr>
-      </w:pPr>
-    </w:p>
-    <w:p>
-      <w:pPr>
-        <w:spacing w:before="0" w:line="240" w:lineRule="auto"/>
-        <w:jc w:val="center"/>
-        <w:rPr>
-          <w:b/>
-          <w:bCs/>
-          <w:sz w:val="32"/>
-          <w:szCs w:val="32"/>
-          <w:u w:val="single"/>
-        </w:rPr>
-      </w:pPr>
-    </w:p>
-    <w:p>
-      <w:pPr>
-        <w:spacing w:before="0" w:line="240" w:lineRule="auto"/>
-        <w:jc w:val="center"/>
-        <w:rPr>
-          <w:b/>
-          <w:bCs/>
-          <w:sz w:val="32"/>
-          <w:szCs w:val="32"/>
-          <w:u w:val="single"/>
-        </w:rPr>
-      </w:pPr>
-    </w:p>
-    <w:p>
-      <w:pPr>
-        <w:spacing w:before="0" w:line="240" w:lineRule="auto"/>
-        <w:jc w:val="center"/>
-        <w:rPr>
-          <w:b/>
-          <w:bCs/>
-          <w:sz w:val="32"/>
-          <w:szCs w:val="32"/>
-          <w:u w:val="single"/>
-        </w:rPr>
-      </w:pPr>
-    </w:p>
-    <w:p>
-      <w:pPr>
-        <w:spacing w:before="0" w:line="240" w:lineRule="auto"/>
-        <w:jc w:val="center"/>
-        <w:rPr>
-          <w:b/>
-          <w:bCs/>
-          <w:sz w:val="32"/>
-          <w:szCs w:val="32"/>
-          <w:u w:val="single"/>
-        </w:rPr>
-      </w:pPr>
       <w:r>
         <w:rPr>
           <w:b/>
@@ -1848,7 +3209,6 @@
           <w:szCs w:val="32"/>
           <w:u w:val="single"/>
         </w:rPr>
-        <w:lastRenderedPageBreak/>
         <w:t xml:space="preserve">TS </w:t>
       </w:r>
       <w:r>
@@ -1871,7 +3231,6 @@
         </w:rPr>
         <w:t xml:space="preserve"> Paatam – TS </w:t>
       </w:r>
-      <w:proofErr w:type="gramStart"/>
       <w:r>
         <w:rPr>
           <w:b/>
@@ -1902,7 +3261,6 @@
         </w:rPr>
         <w:t>Tamil</w:t>
       </w:r>
-      <w:proofErr w:type="gramEnd"/>
       <w:r>
         <w:rPr>
           <w:b/>
@@ -3961,6 +5319,7 @@
                 <w:sz w:val="28"/>
                 <w:szCs w:val="32"/>
               </w:rPr>
+              <w:lastRenderedPageBreak/>
               <w:t>T.S.5.6.2.2 – Kramam</w:t>
             </w:r>
           </w:p>
@@ -4485,7 +5844,6 @@
                 <w:sz w:val="28"/>
                 <w:szCs w:val="32"/>
               </w:rPr>
-              <w:lastRenderedPageBreak/>
               <w:t>T.S.5.6.3.1 – Kramam</w:t>
             </w:r>
           </w:p>
@@ -7258,6 +8616,7 @@
                 <w:sz w:val="28"/>
                 <w:szCs w:val="32"/>
               </w:rPr>
+              <w:lastRenderedPageBreak/>
               <w:t>T.S.5.6.7.1 – Kramam</w:t>
             </w:r>
           </w:p>
@@ -7928,7 +9287,6 @@
                 <w:cs/>
                 <w:lang w:bidi="ta-IN"/>
               </w:rPr>
-              <w:lastRenderedPageBreak/>
               <w:t>ஷடு</w:t>
             </w:r>
             <w:r>
@@ -8025,7 +9383,6 @@
                 <w:cs/>
                 <w:lang w:bidi="ta-IN"/>
               </w:rPr>
-              <w:lastRenderedPageBreak/>
               <w:t>நிர்</w:t>
             </w:r>
             <w:r>
@@ -8159,7 +9516,6 @@
                 <w:cs/>
                 <w:lang w:bidi="ta-IN"/>
               </w:rPr>
-              <w:lastRenderedPageBreak/>
               <w:t>ஷடு</w:t>
             </w:r>
             <w:r>
@@ -8263,7 +9619,6 @@
                 <w:sz w:val="28"/>
                 <w:szCs w:val="32"/>
               </w:rPr>
-              <w:lastRenderedPageBreak/>
               <w:t>T.S.5.6.10.2 – Kramam</w:t>
             </w:r>
           </w:p>
@@ -10321,7 +11676,6 @@
               </w:rPr>
               <w:t>“</w:t>
             </w:r>
-            <w:proofErr w:type="spellStart"/>
             <w:r>
               <w:rPr>
                 <w:b/>
@@ -10334,15 +11688,7 @@
                 <w:b/>
                 <w:bCs/>
               </w:rPr>
-              <w:t>a</w:t>
-            </w:r>
-            <w:proofErr w:type="spellEnd"/>
-            <w:r>
-              <w:rPr>
-                <w:b/>
-                <w:bCs/>
-              </w:rPr>
-              <w:t>”</w:t>
+              <w:t>a”</w:t>
             </w:r>
             <w:r>
               <w:rPr>
@@ -11080,6 +12426,7 @@
           <w:szCs w:val="40"/>
           <w:lang w:val="en-IN" w:eastAsia="en-IN"/>
         </w:rPr>
+        <w:lastRenderedPageBreak/>
         <w:t>"</w:t>
       </w:r>
       <w:r>
@@ -11124,16 +12471,7 @@
           <w:bCs/>
           <w:sz w:val="32"/>
         </w:rPr>
-        <w:t xml:space="preserve">replaced </w:t>
-      </w:r>
-      <w:proofErr w:type="gramStart"/>
-      <w:r>
-        <w:rPr>
-          <w:b/>
-          <w:bCs/>
-          <w:sz w:val="32"/>
-        </w:rPr>
-        <w:t>with</w:t>
+        <w:t>replaced with</w:t>
       </w:r>
       <w:r>
         <w:rPr>
@@ -11155,7 +12493,6 @@
         </w:rPr>
         <w:t>"</w:t>
       </w:r>
-      <w:proofErr w:type="gramEnd"/>
       <w:r>
         <w:rPr>
           <w:rFonts w:ascii="Latha" w:hAnsi="Latha" w:cs="Latha"/>
@@ -11242,29 +12579,6 @@
           <w:szCs w:val="32"/>
           <w:u w:val="single"/>
         </w:rPr>
-        <w:br w:type="page"/>
-      </w:r>
-    </w:p>
-    <w:p>
-      <w:pPr>
-        <w:jc w:val="center"/>
-        <w:rPr>
-          <w:b/>
-          <w:bCs/>
-          <w:sz w:val="32"/>
-          <w:szCs w:val="32"/>
-          <w:u w:val="single"/>
-        </w:rPr>
-      </w:pPr>
-      <w:r>
-        <w:rPr>
-          <w:b/>
-          <w:bCs/>
-          <w:sz w:val="32"/>
-          <w:szCs w:val="32"/>
-          <w:u w:val="single"/>
-        </w:rPr>
-        <w:lastRenderedPageBreak/>
         <w:t xml:space="preserve">TS </w:t>
       </w:r>
       <w:r>
@@ -12536,7 +13850,7 @@
   <w:style w:type="paragraph" w:default="1" w:styleId="Normal">
     <w:name w:val="Normal"/>
     <w:qFormat/>
-    <w:rsid w:val="00076C05"/>
+    <w:rsid w:val="006739B1"/>
     <w:pPr>
       <w:spacing w:before="120" w:line="276" w:lineRule="auto"/>
     </w:pPr>

</xml_diff>

<commit_message>
Update TS 5.6 Tamil Krama Paatam Corrections.docx
</commit_message>
<xml_diff>
--- a/TS-Kramam/TS-5.6/TS 5.6 Tamil Krama Paatam Corrections.docx
+++ b/TS-Kramam/TS-5.6/TS 5.6 Tamil Krama Paatam Corrections.docx
@@ -44,6 +44,7 @@
         </w:rPr>
         <w:t xml:space="preserve"> Paatam – TS </w:t>
       </w:r>
+      <w:proofErr w:type="gramStart"/>
       <w:r>
         <w:rPr>
           <w:b/>
@@ -72,7 +73,18 @@
           <w:szCs w:val="32"/>
           <w:u w:val="single"/>
         </w:rPr>
-        <w:t xml:space="preserve">Tamil </w:t>
+        <w:t>Tamil</w:t>
+      </w:r>
+      <w:proofErr w:type="gramEnd"/>
+      <w:r>
+        <w:rPr>
+          <w:b/>
+          <w:bCs/>
+          <w:sz w:val="32"/>
+          <w:szCs w:val="32"/>
+          <w:u w:val="single"/>
+        </w:rPr>
+        <w:t xml:space="preserve"> </w:t>
       </w:r>
       <w:r>
         <w:rPr>
@@ -102,7 +114,18 @@
           <w:szCs w:val="32"/>
           <w:u w:val="single"/>
         </w:rPr>
-        <w:t xml:space="preserve">Observed till </w:t>
+        <w:t xml:space="preserve">Observed </w:t>
+      </w:r>
+      <w:proofErr w:type="gramStart"/>
+      <w:r>
+        <w:rPr>
+          <w:b/>
+          <w:bCs/>
+          <w:sz w:val="32"/>
+          <w:szCs w:val="32"/>
+          <w:u w:val="single"/>
+        </w:rPr>
+        <w:t xml:space="preserve">till </w:t>
       </w:r>
       <w:r>
         <w:rPr>
@@ -115,6 +138,7 @@
         </w:rPr>
         <w:t>????</w:t>
       </w:r>
+      <w:proofErr w:type="gramEnd"/>
     </w:p>
     <w:p>
       <w:pPr>
@@ -1641,25 +1665,7 @@
                 <w:sz w:val="28"/>
                 <w:szCs w:val="32"/>
               </w:rPr>
-              <w:t>6</w:t>
-            </w:r>
-            <w:r>
-              <w:rPr>
-                <w:rFonts w:cs="Arial"/>
-                <w:b/>
-                <w:sz w:val="28"/>
-                <w:szCs w:val="32"/>
-              </w:rPr>
-              <w:t>.</w:t>
-            </w:r>
-            <w:r>
-              <w:rPr>
-                <w:rFonts w:cs="Arial"/>
-                <w:b/>
-                <w:sz w:val="28"/>
-                <w:szCs w:val="32"/>
-              </w:rPr>
-              <w:t>1</w:t>
+              <w:t>6.1</w:t>
             </w:r>
             <w:r>
               <w:rPr>
@@ -2300,6 +2306,478 @@
                 <w:lang w:bidi="ta-IN"/>
               </w:rPr>
               <w:t xml:space="preserve"> |</w:t>
+            </w:r>
+          </w:p>
+        </w:tc>
+      </w:tr>
+      <w:tr>
+        <w:trPr>
+          <w:trHeight w:val="918"/>
+        </w:trPr>
+        <w:tc>
+          <w:tcPr>
+            <w:tcW w:w="4048" w:type="dxa"/>
+          </w:tcPr>
+          <w:p>
+            <w:pPr>
+              <w:widowControl w:val="0"/>
+              <w:tabs>
+                <w:tab w:val="left" w:pos="993"/>
+              </w:tabs>
+              <w:autoSpaceDE w:val="0"/>
+              <w:autoSpaceDN w:val="0"/>
+              <w:adjustRightInd w:val="0"/>
+              <w:spacing w:before="0" w:line="240" w:lineRule="auto"/>
+              <w:ind w:right="297"/>
+              <w:rPr>
+                <w:rFonts w:cs="Arial"/>
+                <w:b/>
+                <w:color w:val="EE0000"/>
+                <w:sz w:val="28"/>
+                <w:szCs w:val="32"/>
+              </w:rPr>
+            </w:pPr>
+            <w:r>
+              <w:rPr>
+                <w:rFonts w:cs="Arial"/>
+                <w:b/>
+                <w:color w:val="EE0000"/>
+                <w:sz w:val="28"/>
+                <w:szCs w:val="32"/>
+              </w:rPr>
+              <w:t>T.S.5.6.14.1 – Kramam</w:t>
+            </w:r>
+          </w:p>
+          <w:p>
+            <w:pPr>
+              <w:widowControl w:val="0"/>
+              <w:tabs>
+                <w:tab w:val="left" w:pos="993"/>
+              </w:tabs>
+              <w:autoSpaceDE w:val="0"/>
+              <w:autoSpaceDN w:val="0"/>
+              <w:adjustRightInd w:val="0"/>
+              <w:spacing w:before="0" w:line="240" w:lineRule="auto"/>
+              <w:ind w:right="297"/>
+              <w:rPr>
+                <w:rFonts w:cs="Arial"/>
+                <w:b/>
+                <w:color w:val="EE0000"/>
+                <w:sz w:val="28"/>
+                <w:szCs w:val="32"/>
+                <w:lang w:val="en-IN"/>
+              </w:rPr>
+            </w:pPr>
+            <w:r>
+              <w:rPr>
+                <w:rFonts w:cs="Arial"/>
+                <w:b/>
+                <w:color w:val="EE0000"/>
+                <w:sz w:val="28"/>
+                <w:szCs w:val="32"/>
+                <w:lang w:val="en-IN"/>
+              </w:rPr>
+              <w:t>Krama Vaakyam No.– 38</w:t>
+            </w:r>
+          </w:p>
+          <w:p>
+            <w:pPr>
+              <w:widowControl w:val="0"/>
+              <w:tabs>
+                <w:tab w:val="left" w:pos="993"/>
+              </w:tabs>
+              <w:autoSpaceDE w:val="0"/>
+              <w:autoSpaceDN w:val="0"/>
+              <w:adjustRightInd w:val="0"/>
+              <w:spacing w:before="0" w:line="252" w:lineRule="auto"/>
+              <w:ind w:right="297"/>
+              <w:rPr>
+                <w:rFonts w:cs="Arial"/>
+                <w:b/>
+                <w:sz w:val="28"/>
+                <w:szCs w:val="32"/>
+              </w:rPr>
+            </w:pPr>
+            <w:r>
+              <w:rPr>
+                <w:rFonts w:cs="Arial"/>
+                <w:b/>
+                <w:color w:val="EE0000"/>
+                <w:sz w:val="28"/>
+                <w:szCs w:val="32"/>
+                <w:lang w:val="it-IT"/>
+              </w:rPr>
+              <w:t>Panchaati No</w:t>
+            </w:r>
+            <w:r>
+              <w:rPr>
+                <w:rFonts w:cs="Arial"/>
+                <w:b/>
+                <w:color w:val="EE0000"/>
+                <w:szCs w:val="32"/>
+                <w:lang w:val="it-IT"/>
+              </w:rPr>
+              <w:t>. -</w:t>
+            </w:r>
+            <w:r>
+              <w:rPr>
+                <w:rFonts w:cs="Arial"/>
+                <w:b/>
+                <w:color w:val="EE0000"/>
+                <w:sz w:val="28"/>
+                <w:szCs w:val="28"/>
+                <w:lang w:val="it-IT"/>
+              </w:rPr>
+              <w:t xml:space="preserve"> 45</w:t>
+            </w:r>
+          </w:p>
+        </w:tc>
+        <w:tc>
+          <w:tcPr>
+            <w:tcW w:w="4819" w:type="dxa"/>
+          </w:tcPr>
+          <w:p>
+            <w:pPr>
+              <w:widowControl w:val="0"/>
+              <w:autoSpaceDE w:val="0"/>
+              <w:autoSpaceDN w:val="0"/>
+              <w:adjustRightInd w:val="0"/>
+              <w:spacing w:before="0" w:line="240" w:lineRule="auto"/>
+              <w:rPr>
+                <w:rFonts w:ascii="BRH Devanagari Extra" w:hAnsi="BRH Devanagari Extra" w:cs="BRH Devanagari Extra"/>
+                <w:color w:val="EE0000"/>
+                <w:sz w:val="40"/>
+                <w:szCs w:val="40"/>
+                <w:lang w:val="it-IT" w:bidi="ml-IN"/>
+              </w:rPr>
+            </w:pPr>
+            <w:r>
+              <w:rPr>
+                <w:rFonts w:ascii="BRH Devanagari Extra" w:hAnsi="BRH Devanagari Extra" w:cs="BRH Devanagari Extra"/>
+                <w:color w:val="EE0000"/>
+                <w:sz w:val="40"/>
+                <w:szCs w:val="40"/>
+                <w:lang w:val="it-IT" w:bidi="ml-IN"/>
+              </w:rPr>
+              <w:t>zrÉåiÉþsÉsÉÉqÉÉ</w:t>
+            </w:r>
+            <w:r>
+              <w:rPr>
+                <w:rFonts w:ascii="BRH Malayalam Extra" w:hAnsi="BRH Malayalam Extra" w:cs="BRH Devanagari Extra"/>
+                <w:b/>
+                <w:color w:val="EE0000"/>
+                <w:sz w:val="32"/>
+                <w:szCs w:val="40"/>
+                <w:lang w:val="it-IT" w:bidi="ml-IN"/>
+              </w:rPr>
+              <w:t>–</w:t>
+            </w:r>
+            <w:r>
+              <w:rPr>
+                <w:rFonts w:ascii="BRH Devanagari Extra" w:hAnsi="BRH Devanagari Extra" w:cs="BRH Devanagari Extra"/>
+                <w:color w:val="EE0000"/>
+                <w:sz w:val="40"/>
+                <w:szCs w:val="40"/>
+                <w:lang w:val="it-IT" w:bidi="ml-IN"/>
+              </w:rPr>
+              <w:t xml:space="preserve"> CÌiÉ</w:t>
+            </w:r>
+            <w:r>
+              <w:rPr>
+                <w:rFonts w:ascii="BRH Malayalam Extra" w:hAnsi="BRH Malayalam Extra" w:cs="BRH Devanagari Extra"/>
+                <w:b/>
+                <w:color w:val="EE0000"/>
+                <w:sz w:val="32"/>
+                <w:szCs w:val="40"/>
+                <w:lang w:val="it-IT" w:bidi="ml-IN"/>
+              </w:rPr>
+              <w:t>–</w:t>
+            </w:r>
+            <w:r>
+              <w:rPr>
+                <w:rFonts w:ascii="BRH Devanagari Extra" w:hAnsi="BRH Devanagari Extra" w:cs="BRH Devanagari Extra"/>
+                <w:color w:val="EE0000"/>
+                <w:sz w:val="40"/>
+                <w:szCs w:val="40"/>
+                <w:lang w:val="it-IT" w:bidi="ml-IN"/>
+              </w:rPr>
+              <w:t xml:space="preserve"> </w:t>
+            </w:r>
+          </w:p>
+          <w:p>
+            <w:pPr>
+              <w:widowControl w:val="0"/>
+              <w:autoSpaceDE w:val="0"/>
+              <w:autoSpaceDN w:val="0"/>
+              <w:adjustRightInd w:val="0"/>
+              <w:spacing w:before="0" w:line="240" w:lineRule="auto"/>
+              <w:rPr>
+                <w:rFonts w:ascii="Latha" w:hAnsi="Latha" w:cs="Latha"/>
+                <w:sz w:val="28"/>
+                <w:szCs w:val="28"/>
+                <w:cs/>
+                <w:lang w:bidi="ta-IN"/>
+              </w:rPr>
+            </w:pPr>
+            <w:r>
+              <w:rPr>
+                <w:rFonts w:ascii="BRH Devanagari Extra" w:hAnsi="BRH Devanagari Extra" w:cs="BRH Devanagari Extra"/>
+                <w:color w:val="EE0000"/>
+                <w:sz w:val="40"/>
+                <w:szCs w:val="40"/>
+                <w:highlight w:val="yellow"/>
+                <w:lang w:val="it-IT" w:bidi="ml-IN"/>
+              </w:rPr>
+              <w:t>zÉå</w:t>
+            </w:r>
+            <w:r>
+              <w:rPr>
+                <w:rFonts w:ascii="BRH Devanagari Extra" w:hAnsi="BRH Devanagari Extra" w:cs="BRH Devanagari Extra"/>
+                <w:color w:val="EE0000"/>
+                <w:sz w:val="40"/>
+                <w:szCs w:val="40"/>
+                <w:lang w:val="it-IT" w:bidi="ml-IN"/>
+              </w:rPr>
+              <w:t>iÉþ - sÉ</w:t>
+            </w:r>
+            <w:r>
+              <w:rPr>
+                <w:rFonts w:ascii="BRH Malayalam Extra" w:hAnsi="BRH Malayalam Extra" w:cs="BRH Devanagari Extra"/>
+                <w:b/>
+                <w:color w:val="EE0000"/>
+                <w:sz w:val="32"/>
+                <w:szCs w:val="40"/>
+                <w:lang w:val="it-IT" w:bidi="ml-IN"/>
+              </w:rPr>
+              <w:t>–</w:t>
+            </w:r>
+            <w:r>
+              <w:rPr>
+                <w:rFonts w:ascii="BRH Devanagari Extra" w:hAnsi="BRH Devanagari Extra" w:cs="BRH Devanagari Extra"/>
+                <w:color w:val="EE0000"/>
+                <w:sz w:val="40"/>
+                <w:szCs w:val="40"/>
+                <w:lang w:val="it-IT" w:bidi="ml-IN"/>
+              </w:rPr>
+              <w:t>sÉÉ</w:t>
+            </w:r>
+            <w:r>
+              <w:rPr>
+                <w:rFonts w:ascii="BRH Malayalam Extra" w:hAnsi="BRH Malayalam Extra" w:cs="BRH Devanagari Extra"/>
+                <w:b/>
+                <w:color w:val="EE0000"/>
+                <w:sz w:val="32"/>
+                <w:szCs w:val="40"/>
+                <w:lang w:val="it-IT" w:bidi="ml-IN"/>
+              </w:rPr>
+              <w:t>–</w:t>
+            </w:r>
+            <w:r>
+              <w:rPr>
+                <w:rFonts w:ascii="BRH Devanagari Extra" w:hAnsi="BRH Devanagari Extra" w:cs="BRH Devanagari Extra"/>
+                <w:color w:val="EE0000"/>
+                <w:sz w:val="40"/>
+                <w:szCs w:val="40"/>
+                <w:lang w:val="it-IT" w:bidi="ml-IN"/>
+              </w:rPr>
+              <w:t>qÉÉ</w:t>
+            </w:r>
+            <w:r>
+              <w:rPr>
+                <w:rFonts w:ascii="BRH Malayalam Extra" w:hAnsi="BRH Malayalam Extra" w:cs="BRH Devanagari Extra"/>
+                <w:b/>
+                <w:color w:val="EE0000"/>
+                <w:sz w:val="32"/>
+                <w:szCs w:val="40"/>
+                <w:lang w:val="it-IT" w:bidi="ml-IN"/>
+              </w:rPr>
+              <w:t>–</w:t>
+            </w:r>
+            <w:r>
+              <w:rPr>
+                <w:rFonts w:ascii="BRH Devanagari Extra" w:hAnsi="BRH Devanagari Extra" w:cs="BRH Devanagari Extra"/>
+                <w:color w:val="EE0000"/>
+                <w:sz w:val="40"/>
+                <w:szCs w:val="40"/>
+                <w:lang w:val="it-IT" w:bidi="ml-IN"/>
+              </w:rPr>
+              <w:t>È |</w:t>
+            </w:r>
+          </w:p>
+        </w:tc>
+        <w:tc>
+          <w:tcPr>
+            <w:tcW w:w="5103" w:type="dxa"/>
+          </w:tcPr>
+          <w:p>
+            <w:pPr>
+              <w:widowControl w:val="0"/>
+              <w:tabs>
+                <w:tab w:val="left" w:pos="2552"/>
+              </w:tabs>
+              <w:autoSpaceDE w:val="0"/>
+              <w:autoSpaceDN w:val="0"/>
+              <w:adjustRightInd w:val="0"/>
+              <w:spacing w:before="0" w:line="240" w:lineRule="auto"/>
+              <w:rPr>
+                <w:rFonts w:ascii="BRH Devanagari Extra" w:hAnsi="BRH Devanagari Extra" w:cs="BRH Devanagari Extra"/>
+                <w:color w:val="EE0000"/>
+                <w:sz w:val="40"/>
+                <w:szCs w:val="40"/>
+                <w:lang w:val="it-IT" w:bidi="ml-IN"/>
+              </w:rPr>
+            </w:pPr>
+            <w:r>
+              <w:rPr>
+                <w:rFonts w:ascii="BRH Devanagari Extra" w:hAnsi="BRH Devanagari Extra" w:cs="BRH Devanagari Extra"/>
+                <w:color w:val="EE0000"/>
+                <w:sz w:val="40"/>
+                <w:szCs w:val="40"/>
+                <w:lang w:val="it-IT" w:bidi="ml-IN"/>
+              </w:rPr>
+              <w:t>zrÉåiÉþsÉsÉÉqÉÉ</w:t>
+            </w:r>
+            <w:r>
+              <w:rPr>
+                <w:rFonts w:ascii="BRH Malayalam Extra" w:hAnsi="BRH Malayalam Extra" w:cs="BRH Devanagari Extra"/>
+                <w:b/>
+                <w:color w:val="EE0000"/>
+                <w:sz w:val="32"/>
+                <w:szCs w:val="40"/>
+                <w:lang w:val="it-IT" w:bidi="ml-IN"/>
+              </w:rPr>
+              <w:t>–</w:t>
+            </w:r>
+            <w:r>
+              <w:rPr>
+                <w:rFonts w:ascii="BRH Devanagari Extra" w:hAnsi="BRH Devanagari Extra" w:cs="BRH Devanagari Extra"/>
+                <w:color w:val="EE0000"/>
+                <w:sz w:val="40"/>
+                <w:szCs w:val="40"/>
+                <w:lang w:val="it-IT" w:bidi="ml-IN"/>
+              </w:rPr>
+              <w:t xml:space="preserve"> CÌiÉ</w:t>
+            </w:r>
+            <w:r>
+              <w:rPr>
+                <w:rFonts w:ascii="BRH Malayalam Extra" w:hAnsi="BRH Malayalam Extra" w:cs="BRH Devanagari Extra"/>
+                <w:b/>
+                <w:color w:val="EE0000"/>
+                <w:sz w:val="32"/>
+                <w:szCs w:val="40"/>
+                <w:lang w:val="it-IT" w:bidi="ml-IN"/>
+              </w:rPr>
+              <w:t>–</w:t>
+            </w:r>
+            <w:r>
+              <w:rPr>
+                <w:rFonts w:ascii="BRH Devanagari Extra" w:hAnsi="BRH Devanagari Extra" w:cs="BRH Devanagari Extra"/>
+                <w:color w:val="EE0000"/>
+                <w:sz w:val="40"/>
+                <w:szCs w:val="40"/>
+                <w:lang w:val="it-IT" w:bidi="ml-IN"/>
+              </w:rPr>
+              <w:t xml:space="preserve"> </w:t>
+            </w:r>
+          </w:p>
+          <w:p>
+            <w:pPr>
+              <w:widowControl w:val="0"/>
+              <w:autoSpaceDE w:val="0"/>
+              <w:autoSpaceDN w:val="0"/>
+              <w:adjustRightInd w:val="0"/>
+              <w:spacing w:before="0" w:line="240" w:lineRule="auto"/>
+              <w:rPr>
+                <w:rFonts w:ascii="Latha" w:hAnsi="Latha" w:cs="Latha"/>
+                <w:sz w:val="28"/>
+                <w:szCs w:val="28"/>
+                <w:cs/>
+                <w:lang w:bidi="ta-IN"/>
+              </w:rPr>
+            </w:pPr>
+            <w:r>
+              <w:rPr>
+                <w:rFonts w:ascii="BRH Devanagari Extra" w:hAnsi="BRH Devanagari Extra" w:cs="BRH Devanagari Extra"/>
+                <w:color w:val="EE0000"/>
+                <w:sz w:val="40"/>
+                <w:szCs w:val="40"/>
+                <w:highlight w:val="green"/>
+                <w:lang w:val="it-IT" w:bidi="ml-IN"/>
+              </w:rPr>
+              <w:t>zrÉ</w:t>
+            </w:r>
+            <w:r>
+              <w:rPr>
+                <w:rFonts w:ascii="BRH Devanagari Extra" w:hAnsi="BRH Devanagari Extra" w:cs="BRH Devanagari Extra"/>
+                <w:color w:val="EE0000"/>
+                <w:sz w:val="40"/>
+                <w:szCs w:val="40"/>
+                <w:lang w:val="it-IT" w:bidi="ml-IN"/>
+              </w:rPr>
+              <w:t>åiÉþ - sÉ</w:t>
+            </w:r>
+            <w:r>
+              <w:rPr>
+                <w:rFonts w:ascii="BRH Malayalam Extra" w:hAnsi="BRH Malayalam Extra" w:cs="BRH Devanagari Extra"/>
+                <w:b/>
+                <w:color w:val="EE0000"/>
+                <w:sz w:val="32"/>
+                <w:szCs w:val="40"/>
+                <w:lang w:val="it-IT" w:bidi="ml-IN"/>
+              </w:rPr>
+              <w:t>–</w:t>
+            </w:r>
+            <w:r>
+              <w:rPr>
+                <w:rFonts w:ascii="BRH Devanagari Extra" w:hAnsi="BRH Devanagari Extra" w:cs="BRH Devanagari Extra"/>
+                <w:color w:val="EE0000"/>
+                <w:sz w:val="40"/>
+                <w:szCs w:val="40"/>
+                <w:lang w:val="it-IT" w:bidi="ml-IN"/>
+              </w:rPr>
+              <w:t>sÉÉ</w:t>
+            </w:r>
+            <w:r>
+              <w:rPr>
+                <w:rFonts w:ascii="BRH Malayalam Extra" w:hAnsi="BRH Malayalam Extra" w:cs="BRH Devanagari Extra"/>
+                <w:b/>
+                <w:color w:val="EE0000"/>
+                <w:sz w:val="32"/>
+                <w:szCs w:val="40"/>
+                <w:lang w:val="it-IT" w:bidi="ml-IN"/>
+              </w:rPr>
+              <w:t>–</w:t>
+            </w:r>
+            <w:r>
+              <w:rPr>
+                <w:rFonts w:ascii="BRH Devanagari Extra" w:hAnsi="BRH Devanagari Extra" w:cs="BRH Devanagari Extra"/>
+                <w:color w:val="EE0000"/>
+                <w:sz w:val="40"/>
+                <w:szCs w:val="40"/>
+                <w:lang w:val="it-IT" w:bidi="ml-IN"/>
+              </w:rPr>
+              <w:t>qÉÉ</w:t>
+            </w:r>
+            <w:r>
+              <w:rPr>
+                <w:rFonts w:ascii="BRH Malayalam Extra" w:hAnsi="BRH Malayalam Extra" w:cs="BRH Devanagari Extra"/>
+                <w:b/>
+                <w:color w:val="EE0000"/>
+                <w:sz w:val="32"/>
+                <w:szCs w:val="40"/>
+                <w:lang w:val="it-IT" w:bidi="ml-IN"/>
+              </w:rPr>
+              <w:t>–</w:t>
+            </w:r>
+            <w:r>
+              <w:rPr>
+                <w:rFonts w:ascii="BRH Devanagari Extra" w:hAnsi="BRH Devanagari Extra" w:cs="BRH Devanagari Extra"/>
+                <w:color w:val="EE0000"/>
+                <w:sz w:val="40"/>
+                <w:szCs w:val="40"/>
+                <w:lang w:val="it-IT" w:bidi="ml-IN"/>
+              </w:rPr>
+              <w:t xml:space="preserve">È | </w:t>
             </w:r>
           </w:p>
         </w:tc>
@@ -2346,16 +2824,7 @@
                 <w:sz w:val="28"/>
                 <w:szCs w:val="32"/>
               </w:rPr>
-              <w:t>17</w:t>
-            </w:r>
-            <w:r>
-              <w:rPr>
-                <w:rFonts w:cs="Arial"/>
-                <w:b/>
-                <w:sz w:val="28"/>
-                <w:szCs w:val="32"/>
-              </w:rPr>
-              <w:t>.1</w:t>
+              <w:t>17.1</w:t>
             </w:r>
             <w:r>
               <w:rPr>
@@ -2767,6 +3236,7 @@
                 <w:cs/>
                 <w:lang w:bidi="ta-IN"/>
               </w:rPr>
+              <w:lastRenderedPageBreak/>
               <w:t>விஶ்வே</w:t>
             </w:r>
             <w:r>
@@ -2827,6 +3297,7 @@
                 <w:cs/>
                 <w:lang w:bidi="ta-IN"/>
               </w:rPr>
+              <w:lastRenderedPageBreak/>
               <w:t>தி</w:t>
             </w:r>
             <w:r>
@@ -3092,6 +3563,7 @@
                 <w:cs/>
                 <w:lang w:bidi="ta-IN"/>
               </w:rPr>
+              <w:lastRenderedPageBreak/>
               <w:t>விஶ்வே</w:t>
             </w:r>
             <w:r>
@@ -3147,6 +3619,7 @@
           <w:szCs w:val="32"/>
           <w:u w:val="single"/>
         </w:rPr>
+        <w:lastRenderedPageBreak/>
         <w:t>==================</w:t>
       </w:r>
     </w:p>
@@ -3231,6 +3704,7 @@
         </w:rPr>
         <w:t xml:space="preserve"> Paatam – TS </w:t>
       </w:r>
+      <w:proofErr w:type="gramStart"/>
       <w:r>
         <w:rPr>
           <w:b/>
@@ -3261,6 +3735,7 @@
         </w:rPr>
         <w:t>Tamil</w:t>
       </w:r>
+      <w:proofErr w:type="gramEnd"/>
       <w:r>
         <w:rPr>
           <w:b/>
@@ -4854,6 +5329,7 @@
                 <w:sz w:val="28"/>
                 <w:szCs w:val="32"/>
               </w:rPr>
+              <w:lastRenderedPageBreak/>
               <w:t>T.S.5.6.1.4 – Kramam</w:t>
             </w:r>
           </w:p>
@@ -5319,7 +5795,6 @@
                 <w:sz w:val="28"/>
                 <w:szCs w:val="32"/>
               </w:rPr>
-              <w:lastRenderedPageBreak/>
               <w:t>T.S.5.6.2.2 – Kramam</w:t>
             </w:r>
           </w:p>
@@ -7953,6 +8428,7 @@
                 <w:sz w:val="28"/>
                 <w:szCs w:val="32"/>
               </w:rPr>
+              <w:lastRenderedPageBreak/>
               <w:t>T.S.5.6.6.4 – Kramam</w:t>
             </w:r>
           </w:p>
@@ -8616,7 +9092,6 @@
                 <w:sz w:val="28"/>
                 <w:szCs w:val="32"/>
               </w:rPr>
-              <w:lastRenderedPageBreak/>
               <w:t>T.S.5.6.7.1 – Kramam</w:t>
             </w:r>
           </w:p>
@@ -11674,8 +12149,10 @@
                 <w:b/>
                 <w:bCs/>
               </w:rPr>
+              <w:lastRenderedPageBreak/>
               <w:t>“</w:t>
             </w:r>
+            <w:proofErr w:type="spellStart"/>
             <w:r>
               <w:rPr>
                 <w:b/>
@@ -11688,7 +12165,15 @@
                 <w:b/>
                 <w:bCs/>
               </w:rPr>
-              <w:t>a”</w:t>
+              <w:t>a</w:t>
+            </w:r>
+            <w:proofErr w:type="spellEnd"/>
+            <w:r>
+              <w:rPr>
+                <w:b/>
+                <w:bCs/>
+              </w:rPr>
+              <w:t>”</w:t>
             </w:r>
             <w:r>
               <w:rPr>
@@ -11733,6 +12218,7 @@
                 <w:sz w:val="28"/>
                 <w:szCs w:val="32"/>
               </w:rPr>
+              <w:lastRenderedPageBreak/>
               <w:t>T.S.5.6.16.1 – Kramam</w:t>
             </w:r>
           </w:p>
@@ -12426,7 +12912,6 @@
           <w:szCs w:val="40"/>
           <w:lang w:val="en-IN" w:eastAsia="en-IN"/>
         </w:rPr>
-        <w:lastRenderedPageBreak/>
         <w:t>"</w:t>
       </w:r>
       <w:r>
@@ -12471,7 +12956,16 @@
           <w:bCs/>
           <w:sz w:val="32"/>
         </w:rPr>
-        <w:t>replaced with</w:t>
+        <w:t xml:space="preserve">replaced </w:t>
+      </w:r>
+      <w:proofErr w:type="gramStart"/>
+      <w:r>
+        <w:rPr>
+          <w:b/>
+          <w:bCs/>
+          <w:sz w:val="32"/>
+        </w:rPr>
+        <w:t>with</w:t>
       </w:r>
       <w:r>
         <w:rPr>
@@ -12493,6 +12987,7 @@
         </w:rPr>
         <w:t>"</w:t>
       </w:r>
+      <w:proofErr w:type="gramEnd"/>
       <w:r>
         <w:rPr>
           <w:rFonts w:ascii="Latha" w:hAnsi="Latha" w:cs="Latha"/>

</xml_diff>

<commit_message>
TS 5.6 Kramam Tamil addl correction
</commit_message>
<xml_diff>
--- a/TS-Kramam/TS-5.6/TS 5.6 Tamil Krama Paatam Corrections.docx
+++ b/TS-Kramam/TS-5.6/TS 5.6 Tamil Krama Paatam Corrections.docx
@@ -44,7 +44,6 @@
         </w:rPr>
         <w:t xml:space="preserve"> Paatam – TS </w:t>
       </w:r>
-      <w:proofErr w:type="gramStart"/>
       <w:r>
         <w:rPr>
           <w:b/>
@@ -73,18 +72,7 @@
           <w:szCs w:val="32"/>
           <w:u w:val="single"/>
         </w:rPr>
-        <w:t>Tamil</w:t>
-      </w:r>
-      <w:proofErr w:type="gramEnd"/>
-      <w:r>
-        <w:rPr>
-          <w:b/>
-          <w:bCs/>
-          <w:sz w:val="32"/>
-          <w:szCs w:val="32"/>
-          <w:u w:val="single"/>
-        </w:rPr>
-        <w:t xml:space="preserve"> </w:t>
+        <w:t xml:space="preserve">Tamil </w:t>
       </w:r>
       <w:r>
         <w:rPr>
@@ -114,18 +102,7 @@
           <w:szCs w:val="32"/>
           <w:u w:val="single"/>
         </w:rPr>
-        <w:t xml:space="preserve">Observed </w:t>
-      </w:r>
-      <w:proofErr w:type="gramStart"/>
-      <w:r>
-        <w:rPr>
-          <w:b/>
-          <w:bCs/>
-          <w:sz w:val="32"/>
-          <w:szCs w:val="32"/>
-          <w:u w:val="single"/>
-        </w:rPr>
-        <w:t xml:space="preserve">till </w:t>
+        <w:t xml:space="preserve">Observed till </w:t>
       </w:r>
       <w:r>
         <w:rPr>
@@ -138,7 +115,6 @@
         </w:rPr>
         <w:t>????</w:t>
       </w:r>
-      <w:proofErr w:type="gramEnd"/>
     </w:p>
     <w:p>
       <w:pPr>
@@ -2332,18 +2308,16 @@
               <w:rPr>
                 <w:rFonts w:cs="Arial"/>
                 <w:b/>
-                <w:color w:val="EE0000"/>
-                <w:sz w:val="28"/>
-                <w:szCs w:val="32"/>
+                <w:sz w:val="28"/>
+                <w:szCs w:val="28"/>
               </w:rPr>
             </w:pPr>
             <w:r>
               <w:rPr>
                 <w:rFonts w:cs="Arial"/>
                 <w:b/>
-                <w:color w:val="EE0000"/>
-                <w:sz w:val="28"/>
-                <w:szCs w:val="32"/>
+                <w:sz w:val="28"/>
+                <w:szCs w:val="28"/>
               </w:rPr>
               <w:t>T.S.5.6.14.1 – Kramam</w:t>
             </w:r>
@@ -2362,9 +2336,8 @@
               <w:rPr>
                 <w:rFonts w:cs="Arial"/>
                 <w:b/>
-                <w:color w:val="EE0000"/>
-                <w:sz w:val="28"/>
-                <w:szCs w:val="32"/>
+                <w:sz w:val="28"/>
+                <w:szCs w:val="28"/>
                 <w:lang w:val="en-IN"/>
               </w:rPr>
             </w:pPr>
@@ -2372,9 +2345,8 @@
               <w:rPr>
                 <w:rFonts w:cs="Arial"/>
                 <w:b/>
-                <w:color w:val="EE0000"/>
-                <w:sz w:val="28"/>
-                <w:szCs w:val="32"/>
+                <w:sz w:val="28"/>
+                <w:szCs w:val="28"/>
                 <w:lang w:val="en-IN"/>
               </w:rPr>
               <w:t>Krama Vaakyam No.– 38</w:t>
@@ -2402,33 +2374,11 @@
               <w:rPr>
                 <w:rFonts w:cs="Arial"/>
                 <w:b/>
-                <w:color w:val="EE0000"/>
-                <w:sz w:val="28"/>
-                <w:szCs w:val="32"/>
+                <w:sz w:val="28"/>
+                <w:szCs w:val="28"/>
                 <w:lang w:val="it-IT"/>
               </w:rPr>
-              <w:t>Panchaati No</w:t>
-            </w:r>
-            <w:r>
-              <w:rPr>
-                <w:rFonts w:cs="Arial"/>
-                <w:b/>
-                <w:color w:val="EE0000"/>
-                <w:szCs w:val="32"/>
-                <w:lang w:val="it-IT"/>
-              </w:rPr>
-              <w:t>. -</w:t>
-            </w:r>
-            <w:r>
-              <w:rPr>
-                <w:rFonts w:cs="Arial"/>
-                <w:b/>
-                <w:color w:val="EE0000"/>
-                <w:sz w:val="28"/>
-                <w:szCs w:val="28"/>
-                <w:lang w:val="it-IT"/>
-              </w:rPr>
-              <w:t xml:space="preserve"> 45</w:t>
+              <w:t>Panchaati No. - 45</w:t>
             </w:r>
           </w:p>
         </w:tc>
@@ -2444,164 +2394,303 @@
               <w:adjustRightInd w:val="0"/>
               <w:spacing w:before="0" w:line="240" w:lineRule="auto"/>
               <w:rPr>
-                <w:rFonts w:ascii="BRH Devanagari Extra" w:hAnsi="BRH Devanagari Extra" w:cs="BRH Devanagari Extra"/>
-                <w:color w:val="EE0000"/>
-                <w:sz w:val="40"/>
-                <w:szCs w:val="40"/>
-                <w:lang w:val="it-IT" w:bidi="ml-IN"/>
+                <w:rFonts w:ascii="Latha" w:hAnsi="Latha" w:cs="Latha"/>
+                <w:sz w:val="28"/>
+                <w:szCs w:val="28"/>
+                <w:cs/>
+                <w:lang w:bidi="ta-IN"/>
               </w:rPr>
             </w:pPr>
             <w:r>
               <w:rPr>
-                <w:rFonts w:ascii="BRH Devanagari Extra" w:hAnsi="BRH Devanagari Extra" w:cs="BRH Devanagari Extra"/>
-                <w:color w:val="EE0000"/>
-                <w:sz w:val="40"/>
-                <w:szCs w:val="40"/>
-                <w:lang w:val="it-IT" w:bidi="ml-IN"/>
-              </w:rPr>
-              <w:t>zrÉåiÉþsÉsÉÉqÉÉ</w:t>
-            </w:r>
-            <w:r>
-              <w:rPr>
-                <w:rFonts w:ascii="BRH Malayalam Extra" w:hAnsi="BRH Malayalam Extra" w:cs="BRH Devanagari Extra"/>
-                <w:b/>
-                <w:color w:val="EE0000"/>
-                <w:sz w:val="32"/>
-                <w:szCs w:val="40"/>
-                <w:lang w:val="it-IT" w:bidi="ml-IN"/>
-              </w:rPr>
-              <w:t>–</w:t>
-            </w:r>
-            <w:r>
-              <w:rPr>
-                <w:rFonts w:ascii="BRH Devanagari Extra" w:hAnsi="BRH Devanagari Extra" w:cs="BRH Devanagari Extra"/>
-                <w:color w:val="EE0000"/>
-                <w:sz w:val="40"/>
-                <w:szCs w:val="40"/>
-                <w:lang w:val="it-IT" w:bidi="ml-IN"/>
-              </w:rPr>
-              <w:t xml:space="preserve"> CÌiÉ</w:t>
-            </w:r>
-            <w:r>
-              <w:rPr>
-                <w:rFonts w:ascii="BRH Malayalam Extra" w:hAnsi="BRH Malayalam Extra" w:cs="BRH Devanagari Extra"/>
-                <w:b/>
-                <w:color w:val="EE0000"/>
-                <w:sz w:val="32"/>
-                <w:szCs w:val="40"/>
-                <w:lang w:val="it-IT" w:bidi="ml-IN"/>
-              </w:rPr>
-              <w:t>–</w:t>
-            </w:r>
-            <w:r>
-              <w:rPr>
-                <w:rFonts w:ascii="BRH Devanagari Extra" w:hAnsi="BRH Devanagari Extra" w:cs="BRH Devanagari Extra"/>
-                <w:color w:val="EE0000"/>
-                <w:sz w:val="40"/>
-                <w:szCs w:val="40"/>
-                <w:lang w:val="it-IT" w:bidi="ml-IN"/>
+                <w:rFonts w:ascii="Latha" w:hAnsi="Latha" w:cs="Latha"/>
+                <w:sz w:val="28"/>
+                <w:szCs w:val="28"/>
+                <w:cs/>
+                <w:lang w:bidi="ta-IN"/>
+              </w:rPr>
+              <w:t>ஶ்யேத</w:t>
+            </w:r>
+            <w:r>
+              <w:rPr>
+                <w:rFonts w:ascii="BRH Tamil Tab Extra" w:hAnsi="BRH Tamil Tab Extra" w:cs="Latha"/>
+                <w:b/>
+                <w:sz w:val="36"/>
+                <w:szCs w:val="28"/>
+                <w:lang w:bidi="ta-IN"/>
+              </w:rPr>
+              <w:t>†</w:t>
+            </w:r>
+            <w:r>
+              <w:rPr>
+                <w:rFonts w:ascii="Latha" w:hAnsi="Latha" w:cs="Latha"/>
+                <w:sz w:val="28"/>
+                <w:szCs w:val="28"/>
+                <w:cs/>
+                <w:lang w:bidi="ta-IN"/>
+              </w:rPr>
+              <w:t>லலாமா</w:t>
+            </w:r>
+            <w:r>
+              <w:rPr>
+                <w:rFonts w:ascii="Latha" w:hAnsi="Latha" w:cs="Latha"/>
+                <w:b/>
+                <w:bCs/>
+                <w:sz w:val="32"/>
+                <w:szCs w:val="32"/>
+                <w:lang w:bidi="ta-IN"/>
+              </w:rPr>
+              <w:t>,</w:t>
+            </w:r>
+            <w:r>
+              <w:rPr>
+                <w:rFonts w:ascii="Latha" w:hAnsi="Latha" w:cs="Latha"/>
+                <w:sz w:val="28"/>
+                <w:szCs w:val="28"/>
+                <w:cs/>
+                <w:lang w:bidi="ta-IN"/>
+              </w:rPr>
+              <w:t>ஸ்தூப</w:t>
+            </w:r>
+            <w:r>
+              <w:rPr>
+                <w:rFonts w:ascii="BRH Tamil Tab Extra" w:hAnsi="BRH Tamil Tab Extra" w:cs="Latha"/>
+                <w:b/>
+                <w:sz w:val="32"/>
+                <w:szCs w:val="28"/>
+                <w:lang w:bidi="ta-IN"/>
+              </w:rPr>
+              <w:t>…</w:t>
+            </w:r>
+            <w:r>
+              <w:rPr>
+                <w:rFonts w:ascii="Latha" w:hAnsi="Latha" w:cs="Latha"/>
+                <w:sz w:val="28"/>
+                <w:szCs w:val="28"/>
+                <w:cs/>
+                <w:lang w:bidi="ta-IN"/>
+              </w:rPr>
+              <w:t>ரா</w:t>
+            </w:r>
+            <w:r>
+              <w:rPr>
+                <w:rFonts w:ascii="Latha" w:hAnsi="Latha" w:cs="Latha"/>
+                <w:b/>
+                <w:bCs/>
+                <w:sz w:val="32"/>
+                <w:szCs w:val="32"/>
+                <w:cs/>
+                <w:lang w:bidi="ta-IN"/>
+              </w:rPr>
+              <w:t>:</w:t>
+            </w:r>
+            <w:r>
+              <w:rPr>
+                <w:rFonts w:ascii="Latha" w:hAnsi="Latha" w:cs="Latha"/>
+                <w:sz w:val="28"/>
+                <w:szCs w:val="28"/>
+                <w:lang w:bidi="ta-IN"/>
+              </w:rPr>
+              <w:t xml:space="preserve"> | </w:t>
+            </w:r>
+            <w:r>
+              <w:rPr>
+                <w:rFonts w:ascii="Latha" w:hAnsi="Latha" w:cs="Latha"/>
+                <w:sz w:val="28"/>
+                <w:szCs w:val="28"/>
+                <w:cs/>
+                <w:lang w:bidi="ta-IN"/>
+              </w:rPr>
+              <w:t>ஶ்யேத</w:t>
+            </w:r>
+            <w:r>
+              <w:rPr>
+                <w:rFonts w:ascii="BRH Tamil Tab Extra" w:hAnsi="BRH Tamil Tab Extra" w:cs="Latha"/>
+                <w:b/>
+                <w:sz w:val="36"/>
+                <w:szCs w:val="28"/>
+                <w:lang w:bidi="ta-IN"/>
+              </w:rPr>
+              <w:t>†</w:t>
+            </w:r>
+            <w:r>
+              <w:rPr>
+                <w:rFonts w:ascii="Latha" w:hAnsi="Latha" w:cs="Latha"/>
+                <w:sz w:val="28"/>
+                <w:szCs w:val="28"/>
+                <w:cs/>
+                <w:lang w:bidi="ta-IN"/>
+              </w:rPr>
+              <w:t>லலாமா</w:t>
+            </w:r>
+            <w:r>
+              <w:rPr>
+                <w:rFonts w:ascii="BRH Tamil Tab Extra" w:hAnsi="BRH Tamil Tab Extra" w:cs="Latha"/>
+                <w:b/>
+                <w:sz w:val="32"/>
+                <w:szCs w:val="28"/>
+                <w:lang w:bidi="ta-IN"/>
+              </w:rPr>
+              <w:t>…</w:t>
+            </w:r>
+            <w:r>
+              <w:rPr>
+                <w:rFonts w:ascii="Latha" w:hAnsi="Latha" w:cs="Latha"/>
+                <w:sz w:val="28"/>
+                <w:szCs w:val="28"/>
+                <w:lang w:bidi="ta-IN"/>
               </w:rPr>
               <w:t xml:space="preserve"> </w:t>
             </w:r>
-          </w:p>
-          <w:p>
-            <w:pPr>
-              <w:widowControl w:val="0"/>
-              <w:autoSpaceDE w:val="0"/>
-              <w:autoSpaceDN w:val="0"/>
-              <w:adjustRightInd w:val="0"/>
-              <w:spacing w:before="0" w:line="240" w:lineRule="auto"/>
-              <w:rPr>
-                <w:rFonts w:ascii="Latha" w:hAnsi="Latha" w:cs="Latha"/>
-                <w:sz w:val="28"/>
-                <w:szCs w:val="28"/>
-                <w:cs/>
-                <w:lang w:bidi="ta-IN"/>
-              </w:rPr>
-            </w:pPr>
-            <w:r>
-              <w:rPr>
-                <w:rFonts w:ascii="BRH Devanagari Extra" w:hAnsi="BRH Devanagari Extra" w:cs="BRH Devanagari Extra"/>
-                <w:color w:val="EE0000"/>
-                <w:sz w:val="40"/>
-                <w:szCs w:val="40"/>
+            <w:r>
+              <w:rPr>
+                <w:rFonts w:ascii="Latha" w:hAnsi="Latha" w:cs="Latha"/>
+                <w:sz w:val="28"/>
+                <w:szCs w:val="28"/>
+                <w:cs/>
+                <w:lang w:bidi="ta-IN"/>
+              </w:rPr>
+              <w:t>இதி</w:t>
+            </w:r>
+            <w:r>
+              <w:rPr>
+                <w:rFonts w:ascii="BRH Tamil Tab Extra" w:hAnsi="BRH Tamil Tab Extra" w:cs="Latha"/>
+                <w:b/>
+                <w:sz w:val="32"/>
+                <w:szCs w:val="28"/>
+                <w:lang w:bidi="ta-IN"/>
+              </w:rPr>
+              <w:t>…</w:t>
+            </w:r>
+            <w:r>
+              <w:rPr>
+                <w:rFonts w:ascii="Latha" w:hAnsi="Latha" w:cs="Latha"/>
+                <w:sz w:val="28"/>
+                <w:szCs w:val="28"/>
+                <w:lang w:bidi="ta-IN"/>
+              </w:rPr>
+              <w:t xml:space="preserve"> </w:t>
+            </w:r>
+            <w:r>
+              <w:rPr>
+                <w:rFonts w:ascii="Latha" w:hAnsi="Latha" w:cs="Latha"/>
+                <w:sz w:val="28"/>
+                <w:szCs w:val="28"/>
                 <w:highlight w:val="yellow"/>
-                <w:lang w:val="it-IT" w:bidi="ml-IN"/>
-              </w:rPr>
-              <w:t>zÉå</w:t>
-            </w:r>
-            <w:r>
-              <w:rPr>
-                <w:rFonts w:ascii="BRH Devanagari Extra" w:hAnsi="BRH Devanagari Extra" w:cs="BRH Devanagari Extra"/>
-                <w:color w:val="EE0000"/>
-                <w:sz w:val="40"/>
-                <w:szCs w:val="40"/>
-                <w:lang w:val="it-IT" w:bidi="ml-IN"/>
-              </w:rPr>
-              <w:t>iÉþ - sÉ</w:t>
-            </w:r>
-            <w:r>
-              <w:rPr>
-                <w:rFonts w:ascii="BRH Malayalam Extra" w:hAnsi="BRH Malayalam Extra" w:cs="BRH Devanagari Extra"/>
-                <w:b/>
-                <w:color w:val="EE0000"/>
-                <w:sz w:val="32"/>
-                <w:szCs w:val="40"/>
-                <w:lang w:val="it-IT" w:bidi="ml-IN"/>
-              </w:rPr>
-              <w:t>–</w:t>
-            </w:r>
-            <w:r>
-              <w:rPr>
-                <w:rFonts w:ascii="BRH Devanagari Extra" w:hAnsi="BRH Devanagari Extra" w:cs="BRH Devanagari Extra"/>
-                <w:color w:val="EE0000"/>
-                <w:sz w:val="40"/>
-                <w:szCs w:val="40"/>
-                <w:lang w:val="it-IT" w:bidi="ml-IN"/>
-              </w:rPr>
-              <w:t>sÉÉ</w:t>
-            </w:r>
-            <w:r>
-              <w:rPr>
-                <w:rFonts w:ascii="BRH Malayalam Extra" w:hAnsi="BRH Malayalam Extra" w:cs="BRH Devanagari Extra"/>
-                <w:b/>
-                <w:color w:val="EE0000"/>
-                <w:sz w:val="32"/>
-                <w:szCs w:val="40"/>
-                <w:lang w:val="it-IT" w:bidi="ml-IN"/>
-              </w:rPr>
-              <w:t>–</w:t>
-            </w:r>
-            <w:r>
-              <w:rPr>
-                <w:rFonts w:ascii="BRH Devanagari Extra" w:hAnsi="BRH Devanagari Extra" w:cs="BRH Devanagari Extra"/>
-                <w:color w:val="EE0000"/>
-                <w:sz w:val="40"/>
-                <w:szCs w:val="40"/>
-                <w:lang w:val="it-IT" w:bidi="ml-IN"/>
-              </w:rPr>
-              <w:t>qÉÉ</w:t>
-            </w:r>
-            <w:r>
-              <w:rPr>
-                <w:rFonts w:ascii="BRH Malayalam Extra" w:hAnsi="BRH Malayalam Extra" w:cs="BRH Devanagari Extra"/>
-                <w:b/>
-                <w:color w:val="EE0000"/>
-                <w:sz w:val="32"/>
-                <w:szCs w:val="40"/>
-                <w:lang w:val="it-IT" w:bidi="ml-IN"/>
-              </w:rPr>
-              <w:t>–</w:t>
-            </w:r>
-            <w:r>
-              <w:rPr>
-                <w:rFonts w:ascii="BRH Devanagari Extra" w:hAnsi="BRH Devanagari Extra" w:cs="BRH Devanagari Extra"/>
-                <w:color w:val="EE0000"/>
-                <w:sz w:val="40"/>
-                <w:szCs w:val="40"/>
-                <w:lang w:val="it-IT" w:bidi="ml-IN"/>
-              </w:rPr>
-              <w:t>È |</w:t>
+                <w:cs/>
+                <w:lang w:bidi="ta-IN"/>
+              </w:rPr>
+              <w:t>ஶே</w:t>
+            </w:r>
+            <w:r>
+              <w:rPr>
+                <w:rFonts w:ascii="Latha" w:hAnsi="Latha" w:cs="Latha"/>
+                <w:sz w:val="28"/>
+                <w:szCs w:val="28"/>
+                <w:cs/>
+                <w:lang w:bidi="ta-IN"/>
+              </w:rPr>
+              <w:t>த</w:t>
+            </w:r>
+            <w:r>
+              <w:rPr>
+                <w:rFonts w:ascii="BRH Tamil Tab Extra" w:hAnsi="BRH Tamil Tab Extra" w:cs="Latha"/>
+                <w:b/>
+                <w:sz w:val="36"/>
+                <w:szCs w:val="28"/>
+                <w:lang w:bidi="ta-IN"/>
+              </w:rPr>
+              <w:t>†</w:t>
+            </w:r>
+            <w:r>
+              <w:rPr>
+                <w:rFonts w:ascii="Latha" w:hAnsi="Latha" w:cs="Latha"/>
+                <w:sz w:val="28"/>
+                <w:szCs w:val="28"/>
+                <w:lang w:bidi="ta-IN"/>
+              </w:rPr>
+              <w:t xml:space="preserve"> - </w:t>
+            </w:r>
+            <w:r>
+              <w:rPr>
+                <w:rFonts w:ascii="Latha" w:hAnsi="Latha" w:cs="Latha"/>
+                <w:sz w:val="28"/>
+                <w:szCs w:val="28"/>
+                <w:cs/>
+                <w:lang w:bidi="ta-IN"/>
+              </w:rPr>
+              <w:t>ல</w:t>
+            </w:r>
+            <w:r>
+              <w:rPr>
+                <w:rFonts w:ascii="BRH Tamil Tab Extra" w:hAnsi="BRH Tamil Tab Extra" w:cs="Latha"/>
+                <w:b/>
+                <w:sz w:val="32"/>
+                <w:szCs w:val="28"/>
+                <w:lang w:bidi="ta-IN"/>
+              </w:rPr>
+              <w:t>…</w:t>
+            </w:r>
+            <w:r>
+              <w:rPr>
+                <w:rFonts w:ascii="Latha" w:hAnsi="Latha" w:cs="Latha"/>
+                <w:sz w:val="28"/>
+                <w:szCs w:val="28"/>
+                <w:cs/>
+                <w:lang w:bidi="ta-IN"/>
+              </w:rPr>
+              <w:t>லா</w:t>
+            </w:r>
+            <w:r>
+              <w:rPr>
+                <w:rFonts w:ascii="BRH Tamil Tab Extra" w:hAnsi="BRH Tamil Tab Extra" w:cs="Latha"/>
+                <w:b/>
+                <w:sz w:val="32"/>
+                <w:szCs w:val="28"/>
+                <w:lang w:bidi="ta-IN"/>
+              </w:rPr>
+              <w:t>…</w:t>
+            </w:r>
+            <w:r>
+              <w:rPr>
+                <w:rFonts w:ascii="Latha" w:hAnsi="Latha" w:cs="Latha"/>
+                <w:sz w:val="28"/>
+                <w:szCs w:val="28"/>
+                <w:cs/>
+                <w:lang w:bidi="ta-IN"/>
+              </w:rPr>
+              <w:t>மா</w:t>
+            </w:r>
+            <w:r>
+              <w:rPr>
+                <w:rFonts w:ascii="BRH Tamil Tab Extra" w:hAnsi="BRH Tamil Tab Extra" w:cs="Latha"/>
+                <w:b/>
+                <w:sz w:val="32"/>
+                <w:szCs w:val="28"/>
+                <w:lang w:bidi="ta-IN"/>
+              </w:rPr>
+              <w:t>…</w:t>
+            </w:r>
+            <w:r>
+              <w:rPr>
+                <w:rFonts w:ascii="Latha" w:hAnsi="Latha" w:cs="Latha"/>
+                <w:b/>
+                <w:bCs/>
+                <w:sz w:val="32"/>
+                <w:szCs w:val="32"/>
+                <w:cs/>
+                <w:lang w:bidi="ta-IN"/>
+              </w:rPr>
+              <w:t>:</w:t>
+            </w:r>
+            <w:r>
+              <w:rPr>
+                <w:rFonts w:ascii="Latha" w:hAnsi="Latha" w:cs="Latha"/>
+                <w:sz w:val="28"/>
+                <w:szCs w:val="28"/>
+                <w:lang w:bidi="ta-IN"/>
+              </w:rPr>
+              <w:t xml:space="preserve"> |</w:t>
             </w:r>
           </w:p>
         </w:tc>
@@ -2612,172 +2701,308 @@
           <w:p>
             <w:pPr>
               <w:widowControl w:val="0"/>
-              <w:tabs>
-                <w:tab w:val="left" w:pos="2552"/>
-              </w:tabs>
               <w:autoSpaceDE w:val="0"/>
               <w:autoSpaceDN w:val="0"/>
               <w:adjustRightInd w:val="0"/>
               <w:spacing w:before="0" w:line="240" w:lineRule="auto"/>
               <w:rPr>
-                <w:rFonts w:ascii="BRH Devanagari Extra" w:hAnsi="BRH Devanagari Extra" w:cs="BRH Devanagari Extra"/>
-                <w:color w:val="EE0000"/>
-                <w:sz w:val="40"/>
-                <w:szCs w:val="40"/>
-                <w:lang w:val="it-IT" w:bidi="ml-IN"/>
+                <w:rFonts w:ascii="Latha" w:hAnsi="Latha" w:cs="Latha"/>
+                <w:sz w:val="28"/>
+                <w:szCs w:val="28"/>
+                <w:cs/>
+                <w:lang w:bidi="ta-IN"/>
               </w:rPr>
             </w:pPr>
             <w:r>
               <w:rPr>
-                <w:rFonts w:ascii="BRH Devanagari Extra" w:hAnsi="BRH Devanagari Extra" w:cs="BRH Devanagari Extra"/>
-                <w:color w:val="EE0000"/>
-                <w:sz w:val="40"/>
-                <w:szCs w:val="40"/>
-                <w:lang w:val="it-IT" w:bidi="ml-IN"/>
-              </w:rPr>
-              <w:t>zrÉåiÉþsÉsÉÉqÉÉ</w:t>
-            </w:r>
-            <w:r>
-              <w:rPr>
-                <w:rFonts w:ascii="BRH Malayalam Extra" w:hAnsi="BRH Malayalam Extra" w:cs="BRH Devanagari Extra"/>
-                <w:b/>
-                <w:color w:val="EE0000"/>
-                <w:sz w:val="32"/>
-                <w:szCs w:val="40"/>
-                <w:lang w:val="it-IT" w:bidi="ml-IN"/>
-              </w:rPr>
-              <w:t>–</w:t>
-            </w:r>
-            <w:r>
-              <w:rPr>
-                <w:rFonts w:ascii="BRH Devanagari Extra" w:hAnsi="BRH Devanagari Extra" w:cs="BRH Devanagari Extra"/>
-                <w:color w:val="EE0000"/>
-                <w:sz w:val="40"/>
-                <w:szCs w:val="40"/>
-                <w:lang w:val="it-IT" w:bidi="ml-IN"/>
-              </w:rPr>
-              <w:t xml:space="preserve"> CÌiÉ</w:t>
-            </w:r>
-            <w:r>
-              <w:rPr>
-                <w:rFonts w:ascii="BRH Malayalam Extra" w:hAnsi="BRH Malayalam Extra" w:cs="BRH Devanagari Extra"/>
-                <w:b/>
-                <w:color w:val="EE0000"/>
-                <w:sz w:val="32"/>
-                <w:szCs w:val="40"/>
-                <w:lang w:val="it-IT" w:bidi="ml-IN"/>
-              </w:rPr>
-              <w:t>–</w:t>
-            </w:r>
-            <w:r>
-              <w:rPr>
-                <w:rFonts w:ascii="BRH Devanagari Extra" w:hAnsi="BRH Devanagari Extra" w:cs="BRH Devanagari Extra"/>
-                <w:color w:val="EE0000"/>
-                <w:sz w:val="40"/>
-                <w:szCs w:val="40"/>
-                <w:lang w:val="it-IT" w:bidi="ml-IN"/>
+                <w:rFonts w:ascii="Latha" w:hAnsi="Latha" w:cs="Latha"/>
+                <w:sz w:val="28"/>
+                <w:szCs w:val="28"/>
+                <w:cs/>
+                <w:lang w:bidi="ta-IN"/>
+              </w:rPr>
+              <w:t>ஶ்யேத</w:t>
+            </w:r>
+            <w:r>
+              <w:rPr>
+                <w:rFonts w:ascii="BRH Tamil Tab Extra" w:hAnsi="BRH Tamil Tab Extra" w:cs="Latha"/>
+                <w:b/>
+                <w:sz w:val="36"/>
+                <w:szCs w:val="28"/>
+                <w:lang w:bidi="ta-IN"/>
+              </w:rPr>
+              <w:t>†</w:t>
+            </w:r>
+            <w:r>
+              <w:rPr>
+                <w:rFonts w:ascii="Latha" w:hAnsi="Latha" w:cs="Latha"/>
+                <w:sz w:val="28"/>
+                <w:szCs w:val="28"/>
+                <w:cs/>
+                <w:lang w:bidi="ta-IN"/>
+              </w:rPr>
+              <w:t>லலாமா</w:t>
+            </w:r>
+            <w:r>
+              <w:rPr>
+                <w:rFonts w:ascii="Latha" w:hAnsi="Latha" w:cs="Latha"/>
+                <w:b/>
+                <w:bCs/>
+                <w:sz w:val="32"/>
+                <w:szCs w:val="32"/>
+                <w:lang w:bidi="ta-IN"/>
+              </w:rPr>
+              <w:t>,</w:t>
+            </w:r>
+            <w:r>
+              <w:rPr>
+                <w:rFonts w:ascii="Latha" w:hAnsi="Latha" w:cs="Latha"/>
+                <w:sz w:val="28"/>
+                <w:szCs w:val="28"/>
+                <w:cs/>
+                <w:lang w:bidi="ta-IN"/>
+              </w:rPr>
+              <w:t>ஸ்தூப</w:t>
+            </w:r>
+            <w:r>
+              <w:rPr>
+                <w:rFonts w:ascii="BRH Tamil Tab Extra" w:hAnsi="BRH Tamil Tab Extra" w:cs="Latha"/>
+                <w:b/>
+                <w:sz w:val="32"/>
+                <w:szCs w:val="28"/>
+                <w:lang w:bidi="ta-IN"/>
+              </w:rPr>
+              <w:t>…</w:t>
+            </w:r>
+            <w:r>
+              <w:rPr>
+                <w:rFonts w:ascii="Latha" w:hAnsi="Latha" w:cs="Latha"/>
+                <w:sz w:val="28"/>
+                <w:szCs w:val="28"/>
+                <w:cs/>
+                <w:lang w:bidi="ta-IN"/>
+              </w:rPr>
+              <w:t>ரா</w:t>
+            </w:r>
+            <w:r>
+              <w:rPr>
+                <w:rFonts w:ascii="Latha" w:hAnsi="Latha" w:cs="Latha"/>
+                <w:b/>
+                <w:bCs/>
+                <w:sz w:val="32"/>
+                <w:szCs w:val="32"/>
+                <w:cs/>
+                <w:lang w:bidi="ta-IN"/>
+              </w:rPr>
+              <w:t>:</w:t>
+            </w:r>
+            <w:r>
+              <w:rPr>
+                <w:rFonts w:ascii="Latha" w:hAnsi="Latha" w:cs="Latha"/>
+                <w:sz w:val="28"/>
+                <w:szCs w:val="28"/>
+                <w:lang w:bidi="ta-IN"/>
+              </w:rPr>
+              <w:t xml:space="preserve"> | </w:t>
+            </w:r>
+            <w:r>
+              <w:rPr>
+                <w:rFonts w:ascii="Latha" w:hAnsi="Latha" w:cs="Latha"/>
+                <w:sz w:val="28"/>
+                <w:szCs w:val="28"/>
+                <w:cs/>
+                <w:lang w:bidi="ta-IN"/>
+              </w:rPr>
+              <w:t>ஶ்யேத</w:t>
+            </w:r>
+            <w:r>
+              <w:rPr>
+                <w:rFonts w:ascii="BRH Tamil Tab Extra" w:hAnsi="BRH Tamil Tab Extra" w:cs="Latha"/>
+                <w:b/>
+                <w:sz w:val="36"/>
+                <w:szCs w:val="28"/>
+                <w:lang w:bidi="ta-IN"/>
+              </w:rPr>
+              <w:t>†</w:t>
+            </w:r>
+            <w:r>
+              <w:rPr>
+                <w:rFonts w:ascii="Latha" w:hAnsi="Latha" w:cs="Latha"/>
+                <w:sz w:val="28"/>
+                <w:szCs w:val="28"/>
+                <w:cs/>
+                <w:lang w:bidi="ta-IN"/>
+              </w:rPr>
+              <w:t>லலாமா</w:t>
+            </w:r>
+            <w:r>
+              <w:rPr>
+                <w:rFonts w:ascii="BRH Tamil Tab Extra" w:hAnsi="BRH Tamil Tab Extra" w:cs="Latha"/>
+                <w:b/>
+                <w:sz w:val="32"/>
+                <w:szCs w:val="28"/>
+                <w:lang w:bidi="ta-IN"/>
+              </w:rPr>
+              <w:t>…</w:t>
+            </w:r>
+            <w:r>
+              <w:rPr>
+                <w:rFonts w:ascii="Latha" w:hAnsi="Latha" w:cs="Latha"/>
+                <w:sz w:val="28"/>
+                <w:szCs w:val="28"/>
+                <w:lang w:bidi="ta-IN"/>
               </w:rPr>
               <w:t xml:space="preserve"> </w:t>
             </w:r>
-          </w:p>
-          <w:p>
-            <w:pPr>
-              <w:widowControl w:val="0"/>
-              <w:autoSpaceDE w:val="0"/>
-              <w:autoSpaceDN w:val="0"/>
-              <w:adjustRightInd w:val="0"/>
-              <w:spacing w:before="0" w:line="240" w:lineRule="auto"/>
-              <w:rPr>
-                <w:rFonts w:ascii="Latha" w:hAnsi="Latha" w:cs="Latha"/>
-                <w:sz w:val="28"/>
-                <w:szCs w:val="28"/>
-                <w:cs/>
-                <w:lang w:bidi="ta-IN"/>
-              </w:rPr>
-            </w:pPr>
-            <w:r>
-              <w:rPr>
-                <w:rFonts w:ascii="BRH Devanagari Extra" w:hAnsi="BRH Devanagari Extra" w:cs="BRH Devanagari Extra"/>
-                <w:color w:val="EE0000"/>
-                <w:sz w:val="40"/>
-                <w:szCs w:val="40"/>
+            <w:r>
+              <w:rPr>
+                <w:rFonts w:ascii="Latha" w:hAnsi="Latha" w:cs="Latha"/>
+                <w:sz w:val="28"/>
+                <w:szCs w:val="28"/>
+                <w:cs/>
+                <w:lang w:bidi="ta-IN"/>
+              </w:rPr>
+              <w:t>இதி</w:t>
+            </w:r>
+            <w:r>
+              <w:rPr>
+                <w:rFonts w:ascii="BRH Tamil Tab Extra" w:hAnsi="BRH Tamil Tab Extra" w:cs="Latha"/>
+                <w:b/>
+                <w:sz w:val="32"/>
+                <w:szCs w:val="28"/>
+                <w:lang w:bidi="ta-IN"/>
+              </w:rPr>
+              <w:t>…</w:t>
+            </w:r>
+            <w:r>
+              <w:rPr>
+                <w:rFonts w:ascii="Latha" w:hAnsi="Latha" w:cs="Latha"/>
+                <w:sz w:val="28"/>
+                <w:szCs w:val="28"/>
+                <w:lang w:bidi="ta-IN"/>
+              </w:rPr>
+              <w:t xml:space="preserve"> </w:t>
+            </w:r>
+            <w:r>
+              <w:rPr>
+                <w:rFonts w:ascii="Latha" w:hAnsi="Latha" w:cs="Latha"/>
+                <w:sz w:val="28"/>
+                <w:szCs w:val="28"/>
                 <w:highlight w:val="green"/>
-                <w:lang w:val="it-IT" w:bidi="ml-IN"/>
-              </w:rPr>
-              <w:t>zrÉ</w:t>
-            </w:r>
-            <w:r>
-              <w:rPr>
-                <w:rFonts w:ascii="BRH Devanagari Extra" w:hAnsi="BRH Devanagari Extra" w:cs="BRH Devanagari Extra"/>
-                <w:color w:val="EE0000"/>
-                <w:sz w:val="40"/>
-                <w:szCs w:val="40"/>
-                <w:lang w:val="it-IT" w:bidi="ml-IN"/>
-              </w:rPr>
-              <w:t>åiÉþ - sÉ</w:t>
-            </w:r>
-            <w:r>
-              <w:rPr>
-                <w:rFonts w:ascii="BRH Malayalam Extra" w:hAnsi="BRH Malayalam Extra" w:cs="BRH Devanagari Extra"/>
-                <w:b/>
-                <w:color w:val="EE0000"/>
-                <w:sz w:val="32"/>
-                <w:szCs w:val="40"/>
-                <w:lang w:val="it-IT" w:bidi="ml-IN"/>
-              </w:rPr>
-              <w:t>–</w:t>
-            </w:r>
-            <w:r>
-              <w:rPr>
-                <w:rFonts w:ascii="BRH Devanagari Extra" w:hAnsi="BRH Devanagari Extra" w:cs="BRH Devanagari Extra"/>
-                <w:color w:val="EE0000"/>
-                <w:sz w:val="40"/>
-                <w:szCs w:val="40"/>
-                <w:lang w:val="it-IT" w:bidi="ml-IN"/>
-              </w:rPr>
-              <w:t>sÉÉ</w:t>
-            </w:r>
-            <w:r>
-              <w:rPr>
-                <w:rFonts w:ascii="BRH Malayalam Extra" w:hAnsi="BRH Malayalam Extra" w:cs="BRH Devanagari Extra"/>
-                <w:b/>
-                <w:color w:val="EE0000"/>
-                <w:sz w:val="32"/>
-                <w:szCs w:val="40"/>
-                <w:lang w:val="it-IT" w:bidi="ml-IN"/>
-              </w:rPr>
-              <w:t>–</w:t>
-            </w:r>
-            <w:r>
-              <w:rPr>
-                <w:rFonts w:ascii="BRH Devanagari Extra" w:hAnsi="BRH Devanagari Extra" w:cs="BRH Devanagari Extra"/>
-                <w:color w:val="EE0000"/>
-                <w:sz w:val="40"/>
-                <w:szCs w:val="40"/>
-                <w:lang w:val="it-IT" w:bidi="ml-IN"/>
-              </w:rPr>
-              <w:t>qÉÉ</w:t>
-            </w:r>
-            <w:r>
-              <w:rPr>
-                <w:rFonts w:ascii="BRH Malayalam Extra" w:hAnsi="BRH Malayalam Extra" w:cs="BRH Devanagari Extra"/>
-                <w:b/>
-                <w:color w:val="EE0000"/>
-                <w:sz w:val="32"/>
-                <w:szCs w:val="40"/>
-                <w:lang w:val="it-IT" w:bidi="ml-IN"/>
-              </w:rPr>
-              <w:t>–</w:t>
-            </w:r>
-            <w:r>
-              <w:rPr>
-                <w:rFonts w:ascii="BRH Devanagari Extra" w:hAnsi="BRH Devanagari Extra" w:cs="BRH Devanagari Extra"/>
-                <w:color w:val="EE0000"/>
-                <w:sz w:val="40"/>
-                <w:szCs w:val="40"/>
-                <w:lang w:val="it-IT" w:bidi="ml-IN"/>
-              </w:rPr>
-              <w:t xml:space="preserve">È | </w:t>
+                <w:cs/>
+                <w:lang w:bidi="ta-IN"/>
+              </w:rPr>
+              <w:t>ஶ்யே</w:t>
+            </w:r>
+            <w:r>
+              <w:rPr>
+                <w:rFonts w:ascii="Latha" w:hAnsi="Latha" w:cs="Latha"/>
+                <w:sz w:val="28"/>
+                <w:szCs w:val="28"/>
+                <w:cs/>
+                <w:lang w:bidi="ta-IN"/>
+              </w:rPr>
+              <w:t>த</w:t>
+            </w:r>
+            <w:r>
+              <w:rPr>
+                <w:rFonts w:ascii="BRH Tamil Tab Extra" w:hAnsi="BRH Tamil Tab Extra" w:cs="Latha"/>
+                <w:b/>
+                <w:sz w:val="36"/>
+                <w:szCs w:val="28"/>
+                <w:lang w:bidi="ta-IN"/>
+              </w:rPr>
+              <w:t>†</w:t>
+            </w:r>
+            <w:r>
+              <w:rPr>
+                <w:rFonts w:ascii="Latha" w:hAnsi="Latha" w:cs="Latha"/>
+                <w:sz w:val="28"/>
+                <w:szCs w:val="28"/>
+                <w:lang w:bidi="ta-IN"/>
+              </w:rPr>
+              <w:t xml:space="preserve"> - </w:t>
+            </w:r>
+            <w:r>
+              <w:rPr>
+                <w:rFonts w:ascii="Latha" w:hAnsi="Latha" w:cs="Latha"/>
+                <w:sz w:val="28"/>
+                <w:szCs w:val="28"/>
+                <w:cs/>
+                <w:lang w:bidi="ta-IN"/>
+              </w:rPr>
+              <w:t>ல</w:t>
+            </w:r>
+            <w:r>
+              <w:rPr>
+                <w:rFonts w:ascii="BRH Tamil Tab Extra" w:hAnsi="BRH Tamil Tab Extra" w:cs="Latha"/>
+                <w:b/>
+                <w:sz w:val="32"/>
+                <w:szCs w:val="28"/>
+                <w:lang w:bidi="ta-IN"/>
+              </w:rPr>
+              <w:t>…</w:t>
+            </w:r>
+            <w:r>
+              <w:rPr>
+                <w:rFonts w:ascii="Latha" w:hAnsi="Latha" w:cs="Latha"/>
+                <w:sz w:val="28"/>
+                <w:szCs w:val="28"/>
+                <w:cs/>
+                <w:lang w:bidi="ta-IN"/>
+              </w:rPr>
+              <w:t>லா</w:t>
+            </w:r>
+            <w:r>
+              <w:rPr>
+                <w:rFonts w:ascii="BRH Tamil Tab Extra" w:hAnsi="BRH Tamil Tab Extra" w:cs="Latha"/>
+                <w:b/>
+                <w:sz w:val="32"/>
+                <w:szCs w:val="28"/>
+                <w:lang w:bidi="ta-IN"/>
+              </w:rPr>
+              <w:t>…</w:t>
+            </w:r>
+            <w:r>
+              <w:rPr>
+                <w:rFonts w:ascii="Latha" w:hAnsi="Latha" w:cs="Latha"/>
+                <w:sz w:val="28"/>
+                <w:szCs w:val="28"/>
+                <w:cs/>
+                <w:lang w:bidi="ta-IN"/>
+              </w:rPr>
+              <w:t>மா</w:t>
+            </w:r>
+            <w:r>
+              <w:rPr>
+                <w:rFonts w:ascii="BRH Tamil Tab Extra" w:hAnsi="BRH Tamil Tab Extra" w:cs="Latha"/>
+                <w:b/>
+                <w:sz w:val="32"/>
+                <w:szCs w:val="28"/>
+                <w:lang w:bidi="ta-IN"/>
+              </w:rPr>
+              <w:t>…</w:t>
+            </w:r>
+            <w:r>
+              <w:rPr>
+                <w:rFonts w:ascii="Latha" w:hAnsi="Latha" w:cs="Latha"/>
+                <w:b/>
+                <w:bCs/>
+                <w:sz w:val="32"/>
+                <w:szCs w:val="32"/>
+                <w:cs/>
+                <w:lang w:bidi="ta-IN"/>
+              </w:rPr>
+              <w:t>:</w:t>
+            </w:r>
+            <w:r>
+              <w:rPr>
+                <w:rFonts w:ascii="Latha" w:hAnsi="Latha" w:cs="Latha"/>
+                <w:sz w:val="28"/>
+                <w:szCs w:val="28"/>
+                <w:lang w:bidi="ta-IN"/>
+              </w:rPr>
+              <w:t xml:space="preserve"> |</w:t>
             </w:r>
           </w:p>
         </w:tc>
@@ -3704,7 +3929,6 @@
         </w:rPr>
         <w:t xml:space="preserve"> Paatam – TS </w:t>
       </w:r>
-      <w:proofErr w:type="gramStart"/>
       <w:r>
         <w:rPr>
           <w:b/>
@@ -3735,7 +3959,6 @@
         </w:rPr>
         <w:t>Tamil</w:t>
       </w:r>
-      <w:proofErr w:type="gramEnd"/>
       <w:r>
         <w:rPr>
           <w:b/>
@@ -12152,7 +12375,6 @@
               <w:lastRenderedPageBreak/>
               <w:t>“</w:t>
             </w:r>
-            <w:proofErr w:type="spellStart"/>
             <w:r>
               <w:rPr>
                 <w:b/>
@@ -12165,15 +12387,7 @@
                 <w:b/>
                 <w:bCs/>
               </w:rPr>
-              <w:t>a</w:t>
-            </w:r>
-            <w:proofErr w:type="spellEnd"/>
-            <w:r>
-              <w:rPr>
-                <w:b/>
-                <w:bCs/>
-              </w:rPr>
-              <w:t>”</w:t>
+              <w:t>a”</w:t>
             </w:r>
             <w:r>
               <w:rPr>
@@ -12956,16 +13170,7 @@
           <w:bCs/>
           <w:sz w:val="32"/>
         </w:rPr>
-        <w:t xml:space="preserve">replaced </w:t>
-      </w:r>
-      <w:proofErr w:type="gramStart"/>
-      <w:r>
-        <w:rPr>
-          <w:b/>
-          <w:bCs/>
-          <w:sz w:val="32"/>
-        </w:rPr>
-        <w:t>with</w:t>
+        <w:t>replaced with</w:t>
       </w:r>
       <w:r>
         <w:rPr>
@@ -12987,7 +13192,6 @@
         </w:rPr>
         <w:t>"</w:t>
       </w:r>
-      <w:proofErr w:type="gramEnd"/>
       <w:r>
         <w:rPr>
           <w:rFonts w:ascii="Latha" w:hAnsi="Latha" w:cs="Latha"/>

</xml_diff>